<commit_message>
Add trend indicators, Barakah breakdown, expanded sukuk details, and yield date
- StatCard now displays trend direction (up/stable/down) with percentage from trendData
- New Barakah Score Breakdown section with 5-dimension visual score bars on Dashboard
- Portfolio sukuk items show credit rating, risk class, maturity date, issuer, and coupon frequency
- Next yield distribution date displayed in welcome banner
- Enhanced donorData with trendData, barakahBreakdown, and detailed portfolio metadata
- Updated GIFR overview document formatting

Co-Authored-By: Claude Opus 4.6 <noreply@anthropic.com>
</commit_message>
<xml_diff>
--- a/GIFR-Donor-Concierge-Overview.docx
+++ b/GIFR-Donor-Concierge-Overview.docx
@@ -1,6 +1,6 @@
 
 <file path=word/document.xml><?xml version="1.0" encoding="utf-8"?>
-<w:document xmlns:wpc="http://schemas.microsoft.com/office/word/2010/wordprocessingCanvas" xmlns:mc="http://schemas.openxmlformats.org/markup-compatibility/2006" xmlns:o="urn:schemas-microsoft-com:office:office" xmlns:r="http://schemas.openxmlformats.org/officeDocument/2006/relationships" xmlns:m="http://schemas.openxmlformats.org/officeDocument/2006/math" xmlns:v="urn:schemas-microsoft-com:vml" xmlns:wp14="http://schemas.microsoft.com/office/word/2010/wordprocessingDrawing" xmlns:wp="http://schemas.openxmlformats.org/drawingml/2006/wordprocessingDrawing" xmlns:w10="urn:schemas-microsoft-com:office:word" xmlns:w="http://schemas.openxmlformats.org/wordprocessingml/2006/main" xmlns:w14="http://schemas.microsoft.com/office/word/2010/wordml" xmlns:w15="http://schemas.microsoft.com/office/word/2012/wordml" xmlns:wpg="http://schemas.microsoft.com/office/word/2010/wordprocessingGroup" xmlns:wpi="http://schemas.microsoft.com/office/word/2010/wordprocessingInk" xmlns:wne="http://schemas.microsoft.com/office/word/2006/wordml" xmlns:wps="http://schemas.microsoft.com/office/word/2010/wordprocessingShape" xmlns:cx="http://schemas.microsoft.com/office/drawing/2014/chartex" xmlns:cx1="http://schemas.microsoft.com/office/drawing/2015/9/8/chartex" xmlns:cx2="http://schemas.microsoft.com/office/drawing/2015/10/21/chartex" xmlns:cx3="http://schemas.microsoft.com/office/drawing/2016/5/9/chartex" xmlns:cx4="http://schemas.microsoft.com/office/drawing/2016/5/10/chartex" xmlns:cx5="http://schemas.microsoft.com/office/drawing/2016/5/11/chartex" xmlns:cx6="http://schemas.microsoft.com/office/drawing/2016/5/12/chartex" xmlns:cx7="http://schemas.microsoft.com/office/drawing/2016/5/13/chartex" xmlns:cx8="http://schemas.microsoft.com/office/drawing/2016/5/14/chartex" xmlns:aink="http://schemas.microsoft.com/office/drawing/2016/ink" xmlns:am3d="http://schemas.microsoft.com/office/drawing/2017/model3d" xmlns:w16cex="http://schemas.microsoft.com/office/word/2018/wordml/cex" xmlns:w16cid="http://schemas.microsoft.com/office/word/2016/wordml/cid" xmlns:w16="http://schemas.microsoft.com/office/word/2018/wordml" xmlns:w16sdtdh="http://schemas.microsoft.com/office/word/2020/wordml/sdtdatahash" xmlns:w16se="http://schemas.microsoft.com/office/word/2015/wordml/symex" mc:Ignorable="w14 w15 wp14">
+<w:document xmlns:wpc="http://schemas.microsoft.com/office/word/2010/wordprocessingCanvas" xmlns:cx="http://schemas.microsoft.com/office/drawing/2014/chartex" xmlns:cx1="http://schemas.microsoft.com/office/drawing/2015/9/8/chartex" xmlns:cx2="http://schemas.microsoft.com/office/drawing/2015/10/21/chartex" xmlns:cx3="http://schemas.microsoft.com/office/drawing/2016/5/9/chartex" xmlns:cx4="http://schemas.microsoft.com/office/drawing/2016/5/10/chartex" xmlns:cx5="http://schemas.microsoft.com/office/drawing/2016/5/11/chartex" xmlns:cx6="http://schemas.microsoft.com/office/drawing/2016/5/12/chartex" xmlns:cx7="http://schemas.microsoft.com/office/drawing/2016/5/13/chartex" xmlns:cx8="http://schemas.microsoft.com/office/drawing/2016/5/14/chartex" xmlns:mc="http://schemas.openxmlformats.org/markup-compatibility/2006" xmlns:aink="http://schemas.microsoft.com/office/drawing/2016/ink" xmlns:am3d="http://schemas.microsoft.com/office/drawing/2017/model3d" xmlns:o="urn:schemas-microsoft-com:office:office" xmlns:oel="http://schemas.microsoft.com/office/2019/extlst" xmlns:r="http://schemas.openxmlformats.org/officeDocument/2006/relationships" xmlns:m="http://schemas.openxmlformats.org/officeDocument/2006/math" xmlns:v="urn:schemas-microsoft-com:vml" xmlns:wp14="http://schemas.microsoft.com/office/word/2010/wordprocessingDrawing" xmlns:wp="http://schemas.openxmlformats.org/drawingml/2006/wordprocessingDrawing" xmlns:w10="urn:schemas-microsoft-com:office:word" xmlns:w="http://schemas.openxmlformats.org/wordprocessingml/2006/main" xmlns:w14="http://schemas.microsoft.com/office/word/2010/wordml" xmlns:w15="http://schemas.microsoft.com/office/word/2012/wordml" xmlns:w16cex="http://schemas.microsoft.com/office/word/2018/wordml/cex" xmlns:w16cid="http://schemas.microsoft.com/office/word/2016/wordml/cid" xmlns:w16="http://schemas.microsoft.com/office/word/2018/wordml" xmlns:w16du="http://schemas.microsoft.com/office/word/2023/wordml/word16du" xmlns:w16sdtdh="http://schemas.microsoft.com/office/word/2020/wordml/sdtdatahash" xmlns:w16sdtfl="http://schemas.microsoft.com/office/word/2024/wordml/sdtformatlock" xmlns:w16se="http://schemas.microsoft.com/office/word/2015/wordml/symex" xmlns:wpg="http://schemas.microsoft.com/office/word/2010/wordprocessingGroup" xmlns:wpi="http://schemas.microsoft.com/office/word/2010/wordprocessingInk" xmlns:wne="http://schemas.microsoft.com/office/word/2006/wordml" xmlns:wps="http://schemas.microsoft.com/office/word/2010/wordprocessingShape" mc:Ignorable="w14 w15 w16se w16cid w16 w16cex w16sdtdh w16sdtfl w16du wp14">
   <w:body>
     <w:p>
       <w:pPr>
@@ -12,7 +12,7 @@
           <w:sz w:val="48"/>
           <w:szCs w:val="48"/>
         </w:rPr>
-        <w:t xml:space="preserve">🌙</w:t>
+        <w:t>🌙</w:t>
       </w:r>
     </w:p>
     <w:p>
@@ -22,14 +22,13 @@
       </w:pPr>
       <w:r>
         <w:rPr>
-          <w:rFonts w:ascii="Arial" w:cs="Arial" w:eastAsia="Arial" w:hAnsi="Arial"/>
           <w:b/>
           <w:bCs/>
           <w:color w:val="10B981"/>
           <w:sz w:val="44"/>
           <w:szCs w:val="44"/>
         </w:rPr>
-        <w:t xml:space="preserve">GIFR DONOR CONCIERGE</w:t>
+        <w:t>GIFR DONOR CONCIERGE</w:t>
       </w:r>
     </w:p>
     <w:p>
@@ -39,44 +38,49 @@
       </w:pPr>
       <w:r>
         <w:rPr>
-          <w:rFonts w:ascii="Arial" w:cs="Arial" w:eastAsia="Arial" w:hAnsi="Arial"/>
           <w:color w:val="6B7280"/>
           <w:sz w:val="24"/>
           <w:szCs w:val="24"/>
         </w:rPr>
-        <w:t xml:space="preserve">Agentic AI for Islamic Philanthropy</w:t>
+        <w:t>Agentic AI for Islamic Philanthropy</w:t>
       </w:r>
     </w:p>
     <w:tbl>
       <w:tblPr>
-        <w:tblW w:type="pct" w:w="100%"/>
+        <w:tblW w:w="5000" w:type="pct"/>
         <w:tblBorders>
-          <w:top w:val="single" w:color="auto" w:sz="4"/>
-          <w:left w:val="single" w:color="auto" w:sz="4"/>
-          <w:bottom w:val="single" w:color="auto" w:sz="4"/>
-          <w:right w:val="single" w:color="auto" w:sz="4"/>
-          <w:insideH w:val="single" w:color="auto" w:sz="4"/>
-          <w:insideV w:val="single" w:color="auto" w:sz="4"/>
+          <w:top w:val="single" w:sz="4" w:space="0" w:color="auto"/>
+          <w:left w:val="single" w:sz="4" w:space="0" w:color="auto"/>
+          <w:bottom w:val="single" w:sz="4" w:space="0" w:color="auto"/>
+          <w:right w:val="single" w:sz="4" w:space="0" w:color="auto"/>
+          <w:insideH w:val="single" w:sz="4" w:space="0" w:color="auto"/>
+          <w:insideV w:val="single" w:sz="4" w:space="0" w:color="auto"/>
         </w:tblBorders>
+        <w:tblCellMar>
+          <w:left w:w="10" w:type="dxa"/>
+          <w:right w:w="10" w:type="dxa"/>
+        </w:tblCellMar>
+        <w:tblLook w:val="0000" w:firstRow="0" w:lastRow="0" w:firstColumn="0" w:lastColumn="0" w:noHBand="0" w:noVBand="0"/>
       </w:tblPr>
       <w:tblGrid>
-        <w:gridCol w:w="9360"/>
+        <w:gridCol w:w="9350"/>
       </w:tblGrid>
       <w:tr>
+        <w:tblPrEx>
+          <w:tblCellMar>
+            <w:top w:w="0" w:type="dxa"/>
+            <w:bottom w:w="0" w:type="dxa"/>
+          </w:tblCellMar>
+        </w:tblPrEx>
         <w:tc>
           <w:tcPr>
-            <w:tcBorders>
-              <w:top w:val="none"/>
-              <w:left w:val="none"/>
-              <w:bottom w:val="none"/>
-              <w:right w:val="none"/>
-            </w:tcBorders>
-            <w:shd w:fill="ECFDF5" w:val="clear"/>
+            <w:tcW w:w="0" w:type="auto"/>
+            <w:shd w:val="clear" w:color="auto" w:fill="ECFDF5"/>
             <w:tcMar>
-              <w:top w:type="dxa" w:w="200"/>
-              <w:left w:type="dxa" w:w="300"/>
-              <w:bottom w:type="dxa" w:w="200"/>
-              <w:right w:type="dxa" w:w="300"/>
+              <w:top w:w="200" w:type="dxa"/>
+              <w:left w:w="300" w:type="dxa"/>
+              <w:bottom w:w="200" w:type="dxa"/>
+              <w:right w:w="300" w:type="dxa"/>
             </w:tcMar>
           </w:tcPr>
           <w:p>
@@ -85,41 +89,27 @@
             </w:pPr>
             <w:r>
               <w:rPr>
-                <w:rFonts w:ascii="Arial" w:cs="Arial" w:eastAsia="Arial" w:hAnsi="Arial"/>
                 <w:b/>
                 <w:bCs/>
                 <w:color w:val="10B981"/>
                 <w:sz w:val="24"/>
                 <w:szCs w:val="24"/>
               </w:rPr>
-              <w:t xml:space="preserve">Executive Summary</w:t>
-            </w:r>
-          </w:p>
-          <w:p>
-            <w:r>
-              <w:rPr>
-                <w:rFonts w:ascii="Arial" w:cs="Arial" w:eastAsia="Arial" w:hAnsi="Arial"/>
-                <w:sz w:val="22"/>
-                <w:szCs w:val="22"/>
-              </w:rPr>
+              <w:t>Executive Summary</w:t>
+            </w:r>
+          </w:p>
+          <w:p>
+            <w:r>
               <w:t xml:space="preserve">GIFR Donor Concierge adalah aplikasi berbasis </w:t>
             </w:r>
             <w:r>
               <w:rPr>
-                <w:rFonts w:ascii="Arial" w:cs="Arial" w:eastAsia="Arial" w:hAnsi="Arial"/>
                 <w:b/>
                 <w:bCs/>
-                <w:sz w:val="22"/>
-                <w:szCs w:val="22"/>
-              </w:rPr>
-              <w:t xml:space="preserve">Agentic RAG AI</w:t>
-            </w:r>
-            <w:r>
-              <w:rPr>
-                <w:rFonts w:ascii="Arial" w:cs="Arial" w:eastAsia="Arial" w:hAnsi="Arial"/>
-                <w:sz w:val="22"/>
-                <w:szCs w:val="22"/>
-              </w:rPr>
+              </w:rPr>
+              <w:t>Agentic RAG AI</w:t>
+            </w:r>
+            <w:r>
               <w:t xml:space="preserve"> yang dirancang untuk donor High Net-Worth Individual (HNWI) dan institusi. Aplikasi ini menjembatani kontribusi finansial (Waqf) dengan dampak nyata terhadap pengungsi melalui pembaruan yang sangat personal, transparan, dan berbasis data.</w:t>
             </w:r>
           </w:p>
@@ -136,7 +126,7 @@
         <w:pStyle w:val="Heading1"/>
       </w:pPr>
       <w:r>
-        <w:t xml:space="preserve">1. Apa Itu GIFR Donor Concierge?</w:t>
+        <w:t>1. Apa Itu GIFR Donor Concierge?</w:t>
       </w:r>
     </w:p>
     <w:p>
@@ -144,49 +134,28 @@
         <w:spacing w:after="200"/>
       </w:pPr>
       <w:r>
+        <w:t xml:space="preserve">GIFR Donor Concierge adalah </w:t>
+      </w:r>
+      <w:r>
         <w:rPr>
-          <w:rFonts w:ascii="Arial" w:cs="Arial" w:eastAsia="Arial" w:hAnsi="Arial"/>
-          <w:sz w:val="22"/>
-          <w:szCs w:val="22"/>
-        </w:rPr>
-        <w:t xml:space="preserve">GIFR Donor Concierge adalah </w:t>
-      </w:r>
-      <w:r>
-        <w:rPr>
-          <w:rFonts w:ascii="Arial" w:cs="Arial" w:eastAsia="Arial" w:hAnsi="Arial"/>
           <w:b/>
           <w:bCs/>
-          <w:sz w:val="22"/>
-          <w:szCs w:val="22"/>
         </w:rPr>
-        <w:t xml:space="preserve">asisten AI personal</w:t>
+        <w:t>asisten AI personal</w:t>
+      </w:r>
+      <w:r>
+        <w:t xml:space="preserve"> bernama </w:t>
       </w:r>
       <w:r>
         <w:rPr>
-          <w:rFonts w:ascii="Arial" w:cs="Arial" w:eastAsia="Arial" w:hAnsi="Arial"/>
-          <w:sz w:val="22"/>
-          <w:szCs w:val="22"/>
-        </w:rPr>
-        <w:t xml:space="preserve"> bernama </w:t>
-      </w:r>
-      <w:r>
-        <w:rPr>
-          <w:rFonts w:ascii="Arial" w:cs="Arial" w:eastAsia="Arial" w:hAnsi="Arial"/>
           <w:b/>
           <w:bCs/>
           <w:i/>
           <w:iCs/>
-          <w:sz w:val="22"/>
-          <w:szCs w:val="22"/>
         </w:rPr>
-        <w:t xml:space="preserve">Aminah</w:t>
-      </w:r>
-      <w:r>
-        <w:rPr>
-          <w:rFonts w:ascii="Arial" w:cs="Arial" w:eastAsia="Arial" w:hAnsi="Arial"/>
-          <w:sz w:val="22"/>
-          <w:szCs w:val="22"/>
-        </w:rPr>
+        <w:t>Aminah</w:t>
+      </w:r>
+      <w:r>
         <w:t xml:space="preserve"> yang melayani donor Waqf dengan memberikan informasi real-time tentang bagaimana dana mereka bekerja dan menghasilkan dampak.</w:t>
       </w:r>
     </w:p>
@@ -195,373 +164,410 @@
         <w:pStyle w:val="Heading2"/>
       </w:pPr>
       <w:r>
-        <w:t xml:space="preserve">Fitur Utama</w:t>
+        <w:t>Fitur Utama</w:t>
       </w:r>
     </w:p>
     <w:tbl>
       <w:tblPr>
-        <w:tblW w:type="pct" w:w="100%"/>
+        <w:tblW w:w="5000" w:type="pct"/>
         <w:tblBorders>
-          <w:top w:val="single" w:color="auto" w:sz="4"/>
-          <w:left w:val="single" w:color="auto" w:sz="4"/>
-          <w:bottom w:val="single" w:color="auto" w:sz="4"/>
-          <w:right w:val="single" w:color="auto" w:sz="4"/>
-          <w:insideH w:val="single" w:color="auto" w:sz="4"/>
-          <w:insideV w:val="single" w:color="auto" w:sz="4"/>
+          <w:top w:val="single" w:sz="4" w:space="0" w:color="auto"/>
+          <w:left w:val="single" w:sz="4" w:space="0" w:color="auto"/>
+          <w:bottom w:val="single" w:sz="4" w:space="0" w:color="auto"/>
+          <w:right w:val="single" w:sz="4" w:space="0" w:color="auto"/>
+          <w:insideH w:val="single" w:sz="4" w:space="0" w:color="auto"/>
+          <w:insideV w:val="single" w:sz="4" w:space="0" w:color="auto"/>
         </w:tblBorders>
+        <w:tblCellMar>
+          <w:left w:w="10" w:type="dxa"/>
+          <w:right w:w="10" w:type="dxa"/>
+        </w:tblCellMar>
+        <w:tblLook w:val="0000" w:firstRow="0" w:lastRow="0" w:firstColumn="0" w:lastColumn="0" w:noHBand="0" w:noVBand="0"/>
       </w:tblPr>
       <w:tblGrid>
-        <w:gridCol w:w="2500"/>
-        <w:gridCol w:w="6860"/>
+        <w:gridCol w:w="2232"/>
+        <w:gridCol w:w="7126"/>
       </w:tblGrid>
       <w:tr>
+        <w:tblPrEx>
+          <w:tblCellMar>
+            <w:top w:w="0" w:type="dxa"/>
+            <w:bottom w:w="0" w:type="dxa"/>
+          </w:tblCellMar>
+        </w:tblPrEx>
         <w:tc>
           <w:tcPr>
+            <w:tcW w:w="0" w:type="auto"/>
             <w:tcBorders>
-              <w:top w:val="single" w:color="E5E7EB" w:sz="1"/>
-              <w:left w:val="single" w:color="E5E7EB" w:sz="1"/>
-              <w:bottom w:val="single" w:color="E5E7EB" w:sz="1"/>
-              <w:right w:val="single" w:color="E5E7EB" w:sz="1"/>
+              <w:top w:val="single" w:sz="1" w:space="0" w:color="E5E7EB"/>
+              <w:left w:val="single" w:sz="1" w:space="0" w:color="E5E7EB"/>
+              <w:bottom w:val="single" w:sz="1" w:space="0" w:color="E5E7EB"/>
+              <w:right w:val="single" w:sz="1" w:space="0" w:color="E5E7EB"/>
             </w:tcBorders>
-            <w:shd w:fill="10B981" w:val="clear"/>
+            <w:shd w:val="clear" w:color="auto" w:fill="10B981"/>
             <w:tcMar>
-              <w:top w:type="dxa" w:w="100"/>
-              <w:left w:type="dxa" w:w="150"/>
-              <w:bottom w:type="dxa" w:w="100"/>
-              <w:right w:type="dxa" w:w="150"/>
+              <w:top w:w="100" w:type="dxa"/>
+              <w:left w:w="150" w:type="dxa"/>
+              <w:bottom w:w="100" w:type="dxa"/>
+              <w:right w:w="150" w:type="dxa"/>
             </w:tcMar>
           </w:tcPr>
           <w:p>
             <w:r>
               <w:rPr>
-                <w:rFonts w:ascii="Arial" w:cs="Arial" w:eastAsia="Arial" w:hAnsi="Arial"/>
                 <w:b/>
                 <w:bCs/>
                 <w:color w:val="FFFFFF"/>
-                <w:sz w:val="22"/>
-                <w:szCs w:val="22"/>
-              </w:rPr>
-              <w:t xml:space="preserve">Fitur</w:t>
+              </w:rPr>
+              <w:t>Fitur</w:t>
             </w:r>
           </w:p>
         </w:tc>
         <w:tc>
           <w:tcPr>
+            <w:tcW w:w="0" w:type="auto"/>
             <w:tcBorders>
-              <w:top w:val="single" w:color="E5E7EB" w:sz="1"/>
-              <w:left w:val="single" w:color="E5E7EB" w:sz="1"/>
-              <w:bottom w:val="single" w:color="E5E7EB" w:sz="1"/>
-              <w:right w:val="single" w:color="E5E7EB" w:sz="1"/>
+              <w:top w:val="single" w:sz="1" w:space="0" w:color="E5E7EB"/>
+              <w:left w:val="single" w:sz="1" w:space="0" w:color="E5E7EB"/>
+              <w:bottom w:val="single" w:sz="1" w:space="0" w:color="E5E7EB"/>
+              <w:right w:val="single" w:sz="1" w:space="0" w:color="E5E7EB"/>
             </w:tcBorders>
-            <w:shd w:fill="10B981" w:val="clear"/>
+            <w:shd w:val="clear" w:color="auto" w:fill="10B981"/>
             <w:tcMar>
-              <w:top w:type="dxa" w:w="100"/>
-              <w:left w:type="dxa" w:w="150"/>
-              <w:bottom w:type="dxa" w:w="100"/>
-              <w:right w:type="dxa" w:w="150"/>
+              <w:top w:w="100" w:type="dxa"/>
+              <w:left w:w="150" w:type="dxa"/>
+              <w:bottom w:w="100" w:type="dxa"/>
+              <w:right w:w="150" w:type="dxa"/>
             </w:tcMar>
           </w:tcPr>
           <w:p>
             <w:r>
               <w:rPr>
-                <w:rFonts w:ascii="Arial" w:cs="Arial" w:eastAsia="Arial" w:hAnsi="Arial"/>
                 <w:b/>
                 <w:bCs/>
                 <w:color w:val="FFFFFF"/>
-                <w:sz w:val="22"/>
-                <w:szCs w:val="22"/>
-              </w:rPr>
-              <w:t xml:space="preserve">Deskripsi</w:t>
+              </w:rPr>
+              <w:t>Deskripsi</w:t>
             </w:r>
           </w:p>
         </w:tc>
       </w:tr>
       <w:tr>
+        <w:tblPrEx>
+          <w:tblCellMar>
+            <w:top w:w="0" w:type="dxa"/>
+            <w:bottom w:w="0" w:type="dxa"/>
+          </w:tblCellMar>
+        </w:tblPrEx>
         <w:tc>
           <w:tcPr>
+            <w:tcW w:w="0" w:type="auto"/>
             <w:tcBorders>
-              <w:top w:val="single" w:color="E5E7EB" w:sz="1"/>
-              <w:left w:val="single" w:color="E5E7EB" w:sz="1"/>
-              <w:bottom w:val="single" w:color="E5E7EB" w:sz="1"/>
-              <w:right w:val="single" w:color="E5E7EB" w:sz="1"/>
+              <w:top w:val="single" w:sz="1" w:space="0" w:color="E5E7EB"/>
+              <w:left w:val="single" w:sz="1" w:space="0" w:color="E5E7EB"/>
+              <w:bottom w:val="single" w:sz="1" w:space="0" w:color="E5E7EB"/>
+              <w:right w:val="single" w:sz="1" w:space="0" w:color="E5E7EB"/>
             </w:tcBorders>
             <w:tcMar>
-              <w:top w:type="dxa" w:w="80"/>
-              <w:left w:type="dxa" w:w="150"/>
-              <w:bottom w:type="dxa" w:w="80"/>
-              <w:right w:type="dxa" w:w="150"/>
+              <w:top w:w="80" w:type="dxa"/>
+              <w:left w:w="150" w:type="dxa"/>
+              <w:bottom w:w="80" w:type="dxa"/>
+              <w:right w:w="150" w:type="dxa"/>
             </w:tcMar>
           </w:tcPr>
           <w:p>
             <w:r>
               <w:rPr>
-                <w:rFonts w:ascii="Arial" w:cs="Arial" w:eastAsia="Arial" w:hAnsi="Arial"/>
                 <w:b/>
                 <w:bCs/>
                 <w:color w:val="1F2937"/>
                 <w:sz w:val="20"/>
                 <w:szCs w:val="20"/>
               </w:rPr>
-              <w:t xml:space="preserve">Dashboard Personal</w:t>
+              <w:t>Dashboard Personal</w:t>
             </w:r>
           </w:p>
         </w:tc>
         <w:tc>
           <w:tcPr>
+            <w:tcW w:w="0" w:type="auto"/>
             <w:tcBorders>
-              <w:top w:val="single" w:color="E5E7EB" w:sz="1"/>
-              <w:left w:val="single" w:color="E5E7EB" w:sz="1"/>
-              <w:bottom w:val="single" w:color="E5E7EB" w:sz="1"/>
-              <w:right w:val="single" w:color="E5E7EB" w:sz="1"/>
+              <w:top w:val="single" w:sz="1" w:space="0" w:color="E5E7EB"/>
+              <w:left w:val="single" w:sz="1" w:space="0" w:color="E5E7EB"/>
+              <w:bottom w:val="single" w:sz="1" w:space="0" w:color="E5E7EB"/>
+              <w:right w:val="single" w:sz="1" w:space="0" w:color="E5E7EB"/>
             </w:tcBorders>
             <w:tcMar>
-              <w:top w:type="dxa" w:w="80"/>
-              <w:left w:type="dxa" w:w="150"/>
-              <w:bottom w:type="dxa" w:w="80"/>
-              <w:right w:type="dxa" w:w="150"/>
+              <w:top w:w="80" w:type="dxa"/>
+              <w:left w:w="150" w:type="dxa"/>
+              <w:bottom w:w="80" w:type="dxa"/>
+              <w:right w:w="150" w:type="dxa"/>
             </w:tcMar>
           </w:tcPr>
           <w:p>
             <w:r>
               <w:rPr>
-                <w:rFonts w:ascii="Arial" w:cs="Arial" w:eastAsia="Arial" w:hAnsi="Arial"/>
                 <w:color w:val="1F2937"/>
                 <w:sz w:val="20"/>
                 <w:szCs w:val="20"/>
               </w:rPr>
-              <w:t xml:space="preserve">Tampilan ringkas Waqf principal, yield, dan jumlah beneficiary yang terbantu</w:t>
+              <w:t>Tampilan ringkas Waqf principal, yield, dan jumlah beneficiary yang terbantu</w:t>
             </w:r>
           </w:p>
         </w:tc>
       </w:tr>
       <w:tr>
+        <w:tblPrEx>
+          <w:tblCellMar>
+            <w:top w:w="0" w:type="dxa"/>
+            <w:bottom w:w="0" w:type="dxa"/>
+          </w:tblCellMar>
+        </w:tblPrEx>
         <w:tc>
           <w:tcPr>
+            <w:tcW w:w="0" w:type="auto"/>
             <w:tcBorders>
-              <w:top w:val="single" w:color="E5E7EB" w:sz="1"/>
-              <w:left w:val="single" w:color="E5E7EB" w:sz="1"/>
-              <w:bottom w:val="single" w:color="E5E7EB" w:sz="1"/>
-              <w:right w:val="single" w:color="E5E7EB" w:sz="1"/>
+              <w:top w:val="single" w:sz="1" w:space="0" w:color="E5E7EB"/>
+              <w:left w:val="single" w:sz="1" w:space="0" w:color="E5E7EB"/>
+              <w:bottom w:val="single" w:sz="1" w:space="0" w:color="E5E7EB"/>
+              <w:right w:val="single" w:sz="1" w:space="0" w:color="E5E7EB"/>
             </w:tcBorders>
             <w:tcMar>
-              <w:top w:type="dxa" w:w="80"/>
-              <w:left w:type="dxa" w:w="150"/>
-              <w:bottom w:type="dxa" w:w="80"/>
-              <w:right w:type="dxa" w:w="150"/>
+              <w:top w:w="80" w:type="dxa"/>
+              <w:left w:w="150" w:type="dxa"/>
+              <w:bottom w:w="80" w:type="dxa"/>
+              <w:right w:w="150" w:type="dxa"/>
             </w:tcMar>
           </w:tcPr>
           <w:p>
             <w:r>
               <w:rPr>
-                <w:rFonts w:ascii="Arial" w:cs="Arial" w:eastAsia="Arial" w:hAnsi="Arial"/>
                 <w:b/>
                 <w:bCs/>
                 <w:color w:val="1F2937"/>
                 <w:sz w:val="20"/>
                 <w:szCs w:val="20"/>
               </w:rPr>
-              <w:t xml:space="preserve">Portfolio Sukuk</w:t>
+              <w:t>Portfolio Sukuk</w:t>
             </w:r>
           </w:p>
         </w:tc>
         <w:tc>
           <w:tcPr>
+            <w:tcW w:w="0" w:type="auto"/>
             <w:tcBorders>
-              <w:top w:val="single" w:color="E5E7EB" w:sz="1"/>
-              <w:left w:val="single" w:color="E5E7EB" w:sz="1"/>
-              <w:bottom w:val="single" w:color="E5E7EB" w:sz="1"/>
-              <w:right w:val="single" w:color="E5E7EB" w:sz="1"/>
+              <w:top w:val="single" w:sz="1" w:space="0" w:color="E5E7EB"/>
+              <w:left w:val="single" w:sz="1" w:space="0" w:color="E5E7EB"/>
+              <w:bottom w:val="single" w:sz="1" w:space="0" w:color="E5E7EB"/>
+              <w:right w:val="single" w:sz="1" w:space="0" w:color="E5E7EB"/>
             </w:tcBorders>
             <w:tcMar>
-              <w:top w:type="dxa" w:w="80"/>
-              <w:left w:type="dxa" w:w="150"/>
-              <w:bottom w:type="dxa" w:w="80"/>
-              <w:right w:type="dxa" w:w="150"/>
+              <w:top w:w="80" w:type="dxa"/>
+              <w:left w:w="150" w:type="dxa"/>
+              <w:bottom w:w="80" w:type="dxa"/>
+              <w:right w:w="150" w:type="dxa"/>
             </w:tcMar>
           </w:tcPr>
           <w:p>
             <w:r>
               <w:rPr>
-                <w:rFonts w:ascii="Arial" w:cs="Arial" w:eastAsia="Arial" w:hAnsi="Arial"/>
                 <w:color w:val="1F2937"/>
                 <w:sz w:val="20"/>
                 <w:szCs w:val="20"/>
               </w:rPr>
-              <w:t xml:space="preserve">Detail alokasi investasi dengan sertifikasi Sharia dari AAOIFI</w:t>
+              <w:t>Detail alokasi investasi dengan sertifikasi Sharia dari AAOIFI</w:t>
             </w:r>
           </w:p>
         </w:tc>
       </w:tr>
       <w:tr>
+        <w:tblPrEx>
+          <w:tblCellMar>
+            <w:top w:w="0" w:type="dxa"/>
+            <w:bottom w:w="0" w:type="dxa"/>
+          </w:tblCellMar>
+        </w:tblPrEx>
         <w:tc>
           <w:tcPr>
+            <w:tcW w:w="0" w:type="auto"/>
             <w:tcBorders>
-              <w:top w:val="single" w:color="E5E7EB" w:sz="1"/>
-              <w:left w:val="single" w:color="E5E7EB" w:sz="1"/>
-              <w:bottom w:val="single" w:color="E5E7EB" w:sz="1"/>
-              <w:right w:val="single" w:color="E5E7EB" w:sz="1"/>
+              <w:top w:val="single" w:sz="1" w:space="0" w:color="E5E7EB"/>
+              <w:left w:val="single" w:sz="1" w:space="0" w:color="E5E7EB"/>
+              <w:bottom w:val="single" w:sz="1" w:space="0" w:color="E5E7EB"/>
+              <w:right w:val="single" w:sz="1" w:space="0" w:color="E5E7EB"/>
             </w:tcBorders>
             <w:tcMar>
-              <w:top w:type="dxa" w:w="80"/>
-              <w:left w:type="dxa" w:w="150"/>
-              <w:bottom w:type="dxa" w:w="80"/>
-              <w:right w:type="dxa" w:w="150"/>
+              <w:top w:w="80" w:type="dxa"/>
+              <w:left w:w="150" w:type="dxa"/>
+              <w:bottom w:w="80" w:type="dxa"/>
+              <w:right w:w="150" w:type="dxa"/>
             </w:tcMar>
           </w:tcPr>
           <w:p>
             <w:r>
               <w:rPr>
-                <w:rFonts w:ascii="Arial" w:cs="Arial" w:eastAsia="Arial" w:hAnsi="Arial"/>
                 <w:b/>
                 <w:bCs/>
                 <w:color w:val="1F2937"/>
                 <w:sz w:val="20"/>
                 <w:szCs w:val="20"/>
               </w:rPr>
-              <w:t xml:space="preserve">Impact Tracking</w:t>
+              <w:t>Impact Tracking</w:t>
             </w:r>
           </w:p>
         </w:tc>
         <w:tc>
           <w:tcPr>
+            <w:tcW w:w="0" w:type="auto"/>
             <w:tcBorders>
-              <w:top w:val="single" w:color="E5E7EB" w:sz="1"/>
-              <w:left w:val="single" w:color="E5E7EB" w:sz="1"/>
-              <w:bottom w:val="single" w:color="E5E7EB" w:sz="1"/>
-              <w:right w:val="single" w:color="E5E7EB" w:sz="1"/>
+              <w:top w:val="single" w:sz="1" w:space="0" w:color="E5E7EB"/>
+              <w:left w:val="single" w:sz="1" w:space="0" w:color="E5E7EB"/>
+              <w:bottom w:val="single" w:sz="1" w:space="0" w:color="E5E7EB"/>
+              <w:right w:val="single" w:sz="1" w:space="0" w:color="E5E7EB"/>
             </w:tcBorders>
             <w:tcMar>
-              <w:top w:type="dxa" w:w="80"/>
-              <w:left w:type="dxa" w:w="150"/>
-              <w:bottom w:type="dxa" w:w="80"/>
-              <w:right w:type="dxa" w:w="150"/>
+              <w:top w:w="80" w:type="dxa"/>
+              <w:left w:w="150" w:type="dxa"/>
+              <w:bottom w:w="80" w:type="dxa"/>
+              <w:right w:w="150" w:type="dxa"/>
             </w:tcMar>
           </w:tcPr>
           <w:p>
             <w:r>
               <w:rPr>
-                <w:rFonts w:ascii="Arial" w:cs="Arial" w:eastAsia="Arial" w:hAnsi="Arial"/>
                 <w:color w:val="1F2937"/>
                 <w:sz w:val="20"/>
                 <w:szCs w:val="20"/>
               </w:rPr>
-              <w:t xml:space="preserve">Cerita beneficiary dengan foto, lokasi GPS, dan laporan lapangan</w:t>
+              <w:t>Cerita beneficiary dengan foto, lokasi GPS, dan laporan lapangan</w:t>
             </w:r>
           </w:p>
         </w:tc>
       </w:tr>
       <w:tr>
+        <w:tblPrEx>
+          <w:tblCellMar>
+            <w:top w:w="0" w:type="dxa"/>
+            <w:bottom w:w="0" w:type="dxa"/>
+          </w:tblCellMar>
+        </w:tblPrEx>
         <w:tc>
           <w:tcPr>
+            <w:tcW w:w="0" w:type="auto"/>
             <w:tcBorders>
-              <w:top w:val="single" w:color="E5E7EB" w:sz="1"/>
-              <w:left w:val="single" w:color="E5E7EB" w:sz="1"/>
-              <w:bottom w:val="single" w:color="E5E7EB" w:sz="1"/>
-              <w:right w:val="single" w:color="E5E7EB" w:sz="1"/>
+              <w:top w:val="single" w:sz="1" w:space="0" w:color="E5E7EB"/>
+              <w:left w:val="single" w:sz="1" w:space="0" w:color="E5E7EB"/>
+              <w:bottom w:val="single" w:sz="1" w:space="0" w:color="E5E7EB"/>
+              <w:right w:val="single" w:sz="1" w:space="0" w:color="E5E7EB"/>
             </w:tcBorders>
             <w:tcMar>
-              <w:top w:type="dxa" w:w="80"/>
-              <w:left w:type="dxa" w:w="150"/>
-              <w:bottom w:type="dxa" w:w="80"/>
-              <w:right w:type="dxa" w:w="150"/>
+              <w:top w:w="80" w:type="dxa"/>
+              <w:left w:w="150" w:type="dxa"/>
+              <w:bottom w:w="80" w:type="dxa"/>
+              <w:right w:w="150" w:type="dxa"/>
             </w:tcMar>
           </w:tcPr>
           <w:p>
             <w:r>
               <w:rPr>
-                <w:rFonts w:ascii="Arial" w:cs="Arial" w:eastAsia="Arial" w:hAnsi="Arial"/>
                 <w:b/>
                 <w:bCs/>
                 <w:color w:val="1F2937"/>
                 <w:sz w:val="20"/>
                 <w:szCs w:val="20"/>
               </w:rPr>
-              <w:t xml:space="preserve">Aminah AI Chat</w:t>
+              <w:t>Aminah AI Chat</w:t>
             </w:r>
           </w:p>
         </w:tc>
         <w:tc>
           <w:tcPr>
+            <w:tcW w:w="0" w:type="auto"/>
             <w:tcBorders>
-              <w:top w:val="single" w:color="E5E7EB" w:sz="1"/>
-              <w:left w:val="single" w:color="E5E7EB" w:sz="1"/>
-              <w:bottom w:val="single" w:color="E5E7EB" w:sz="1"/>
-              <w:right w:val="single" w:color="E5E7EB" w:sz="1"/>
+              <w:top w:val="single" w:sz="1" w:space="0" w:color="E5E7EB"/>
+              <w:left w:val="single" w:sz="1" w:space="0" w:color="E5E7EB"/>
+              <w:bottom w:val="single" w:sz="1" w:space="0" w:color="E5E7EB"/>
+              <w:right w:val="single" w:sz="1" w:space="0" w:color="E5E7EB"/>
             </w:tcBorders>
             <w:tcMar>
-              <w:top w:type="dxa" w:w="80"/>
-              <w:left w:type="dxa" w:w="150"/>
-              <w:bottom w:type="dxa" w:w="80"/>
-              <w:right w:type="dxa" w:w="150"/>
+              <w:top w:w="80" w:type="dxa"/>
+              <w:left w:w="150" w:type="dxa"/>
+              <w:bottom w:w="80" w:type="dxa"/>
+              <w:right w:w="150" w:type="dxa"/>
             </w:tcMar>
           </w:tcPr>
           <w:p>
             <w:r>
               <w:rPr>
-                <w:rFonts w:ascii="Arial" w:cs="Arial" w:eastAsia="Arial" w:hAnsi="Arial"/>
                 <w:color w:val="1F2937"/>
                 <w:sz w:val="20"/>
                 <w:szCs w:val="20"/>
               </w:rPr>
-              <w:t xml:space="preserve">Percakapan interaktif untuk pertanyaan audit, simulasi reinvestasi, dan lainnya</w:t>
+              <w:t>Percakapan interaktif untuk pertanyaan audit, simulasi reinvestasi, dan lainnya</w:t>
             </w:r>
           </w:p>
         </w:tc>
       </w:tr>
       <w:tr>
+        <w:tblPrEx>
+          <w:tblCellMar>
+            <w:top w:w="0" w:type="dxa"/>
+            <w:bottom w:w="0" w:type="dxa"/>
+          </w:tblCellMar>
+        </w:tblPrEx>
         <w:tc>
           <w:tcPr>
+            <w:tcW w:w="0" w:type="auto"/>
             <w:tcBorders>
-              <w:top w:val="single" w:color="E5E7EB" w:sz="1"/>
-              <w:left w:val="single" w:color="E5E7EB" w:sz="1"/>
-              <w:bottom w:val="single" w:color="E5E7EB" w:sz="1"/>
-              <w:right w:val="single" w:color="E5E7EB" w:sz="1"/>
+              <w:top w:val="single" w:sz="1" w:space="0" w:color="E5E7EB"/>
+              <w:left w:val="single" w:sz="1" w:space="0" w:color="E5E7EB"/>
+              <w:bottom w:val="single" w:sz="1" w:space="0" w:color="E5E7EB"/>
+              <w:right w:val="single" w:sz="1" w:space="0" w:color="E5E7EB"/>
             </w:tcBorders>
             <w:tcMar>
-              <w:top w:type="dxa" w:w="80"/>
-              <w:left w:type="dxa" w:w="150"/>
-              <w:bottom w:type="dxa" w:w="80"/>
-              <w:right w:type="dxa" w:w="150"/>
+              <w:top w:w="80" w:type="dxa"/>
+              <w:left w:w="150" w:type="dxa"/>
+              <w:bottom w:w="80" w:type="dxa"/>
+              <w:right w:w="150" w:type="dxa"/>
             </w:tcMar>
           </w:tcPr>
           <w:p>
             <w:r>
               <w:rPr>
-                <w:rFonts w:ascii="Arial" w:cs="Arial" w:eastAsia="Arial" w:hAnsi="Arial"/>
                 <w:b/>
                 <w:bCs/>
                 <w:color w:val="1F2937"/>
                 <w:sz w:val="20"/>
                 <w:szCs w:val="20"/>
               </w:rPr>
-              <w:t xml:space="preserve">Transparansi Fee</w:t>
+              <w:t>Transparansi Fee</w:t>
             </w:r>
           </w:p>
         </w:tc>
         <w:tc>
           <w:tcPr>
+            <w:tcW w:w="0" w:type="auto"/>
             <w:tcBorders>
-              <w:top w:val="single" w:color="E5E7EB" w:sz="1"/>
-              <w:left w:val="single" w:color="E5E7EB" w:sz="1"/>
-              <w:bottom w:val="single" w:color="E5E7EB" w:sz="1"/>
-              <w:right w:val="single" w:color="E5E7EB" w:sz="1"/>
+              <w:top w:val="single" w:sz="1" w:space="0" w:color="E5E7EB"/>
+              <w:left w:val="single" w:sz="1" w:space="0" w:color="E5E7EB"/>
+              <w:bottom w:val="single" w:sz="1" w:space="0" w:color="E5E7EB"/>
+              <w:right w:val="single" w:sz="1" w:space="0" w:color="E5E7EB"/>
             </w:tcBorders>
             <w:tcMar>
-              <w:top w:type="dxa" w:w="80"/>
-              <w:left w:type="dxa" w:w="150"/>
-              <w:bottom w:type="dxa" w:w="80"/>
-              <w:right w:type="dxa" w:w="150"/>
+              <w:top w:w="80" w:type="dxa"/>
+              <w:left w:w="150" w:type="dxa"/>
+              <w:bottom w:w="80" w:type="dxa"/>
+              <w:right w:w="150" w:type="dxa"/>
             </w:tcMar>
           </w:tcPr>
           <w:p>
             <w:r>
               <w:rPr>
-                <w:rFonts w:ascii="Arial" w:cs="Arial" w:eastAsia="Arial" w:hAnsi="Arial"/>
                 <w:color w:val="1F2937"/>
                 <w:sz w:val="20"/>
                 <w:szCs w:val="20"/>
               </w:rPr>
-              <w:t xml:space="preserve">Breakdown lengkap dari gross yield hingga net distributable (94% ke impact)</w:t>
+              <w:t>Breakdown lengkap dari gross yield hingga net distributable (94% ke impact)</w:t>
             </w:r>
           </w:p>
         </w:tc>
@@ -574,10 +580,31 @@
     </w:p>
     <w:p>
       <w:pPr>
+        <w:spacing w:before="300"/>
+      </w:pPr>
+    </w:p>
+    <w:p>
+      <w:pPr>
+        <w:spacing w:before="300"/>
+      </w:pPr>
+    </w:p>
+    <w:p>
+      <w:pPr>
+        <w:spacing w:before="300"/>
+      </w:pPr>
+    </w:p>
+    <w:p>
+      <w:pPr>
+        <w:spacing w:before="300"/>
+      </w:pPr>
+    </w:p>
+    <w:p>
+      <w:pPr>
         <w:pStyle w:val="Heading1"/>
       </w:pPr>
       <w:r>
-        <w:t xml:space="preserve">2. Bagaimana Cara Kerjanya?</w:t>
+        <w:lastRenderedPageBreak/>
+        <w:t>2. Bagaimana Cara Kerjanya?</w:t>
       </w:r>
     </w:p>
     <w:p>
@@ -585,64 +612,63 @@
         <w:spacing w:after="200"/>
       </w:pPr>
       <w:r>
+        <w:t xml:space="preserve">Aplikasi ini menggunakan arsitektur </w:t>
+      </w:r>
+      <w:r>
         <w:rPr>
-          <w:rFonts w:ascii="Arial" w:cs="Arial" w:eastAsia="Arial" w:hAnsi="Arial"/>
-          <w:sz w:val="22"/>
-          <w:szCs w:val="22"/>
-        </w:rPr>
-        <w:t xml:space="preserve">Aplikasi ini menggunakan arsitektur </w:t>
-      </w:r>
-      <w:r>
-        <w:rPr>
-          <w:rFonts w:ascii="Arial" w:cs="Arial" w:eastAsia="Arial" w:hAnsi="Arial"/>
           <w:b/>
           <w:bCs/>
-          <w:sz w:val="22"/>
-          <w:szCs w:val="22"/>
         </w:rPr>
-        <w:t xml:space="preserve">Agentic RAG (Retrieval-Augmented Generation)</w:t>
-      </w:r>
-      <w:r>
-        <w:rPr>
-          <w:rFonts w:ascii="Arial" w:cs="Arial" w:eastAsia="Arial" w:hAnsi="Arial"/>
-          <w:sz w:val="22"/>
-          <w:szCs w:val="22"/>
-        </w:rPr>
+        <w:t>Agentic RAG (Retrieval-Augmented Generation)</w:t>
+      </w:r>
+      <w:r>
         <w:t xml:space="preserve"> dengan Knowledge Graph yang menghubungkan tiga layer data:</w:t>
       </w:r>
     </w:p>
     <w:tbl>
       <w:tblPr>
-        <w:tblW w:type="pct" w:w="100%"/>
+        <w:tblW w:w="5000" w:type="pct"/>
         <w:tblBorders>
-          <w:top w:val="single" w:color="auto" w:sz="4"/>
-          <w:left w:val="single" w:color="auto" w:sz="4"/>
-          <w:bottom w:val="single" w:color="auto" w:sz="4"/>
-          <w:right w:val="single" w:color="auto" w:sz="4"/>
-          <w:insideH w:val="single" w:color="auto" w:sz="4"/>
-          <w:insideV w:val="single" w:color="auto" w:sz="4"/>
+          <w:top w:val="single" w:sz="4" w:space="0" w:color="auto"/>
+          <w:left w:val="single" w:sz="4" w:space="0" w:color="auto"/>
+          <w:bottom w:val="single" w:sz="4" w:space="0" w:color="auto"/>
+          <w:right w:val="single" w:sz="4" w:space="0" w:color="auto"/>
+          <w:insideH w:val="single" w:sz="4" w:space="0" w:color="auto"/>
+          <w:insideV w:val="single" w:sz="4" w:space="0" w:color="auto"/>
         </w:tblBorders>
+        <w:tblCellMar>
+          <w:left w:w="10" w:type="dxa"/>
+          <w:right w:w="10" w:type="dxa"/>
+        </w:tblCellMar>
+        <w:tblLook w:val="0000" w:firstRow="0" w:lastRow="0" w:firstColumn="0" w:lastColumn="0" w:noHBand="0" w:noVBand="0"/>
       </w:tblPr>
       <w:tblGrid>
-        <w:gridCol w:w="2800"/>
-        <w:gridCol w:w="3280"/>
-        <w:gridCol w:w="3280"/>
+        <w:gridCol w:w="3137"/>
+        <w:gridCol w:w="2978"/>
+        <w:gridCol w:w="3243"/>
       </w:tblGrid>
       <w:tr>
+        <w:tblPrEx>
+          <w:tblCellMar>
+            <w:top w:w="0" w:type="dxa"/>
+            <w:bottom w:w="0" w:type="dxa"/>
+          </w:tblCellMar>
+        </w:tblPrEx>
         <w:tc>
           <w:tcPr>
+            <w:tcW w:w="0" w:type="auto"/>
             <w:tcBorders>
-              <w:top w:val="single" w:color="E5E7EB" w:sz="1"/>
-              <w:left w:val="single" w:color="E5E7EB" w:sz="1"/>
-              <w:bottom w:val="single" w:color="E5E7EB" w:sz="1"/>
-              <w:right w:val="single" w:color="E5E7EB" w:sz="1"/>
+              <w:top w:val="single" w:sz="1" w:space="0" w:color="E5E7EB"/>
+              <w:left w:val="single" w:sz="1" w:space="0" w:color="E5E7EB"/>
+              <w:bottom w:val="single" w:sz="1" w:space="0" w:color="E5E7EB"/>
+              <w:right w:val="single" w:sz="1" w:space="0" w:color="E5E7EB"/>
             </w:tcBorders>
-            <w:shd w:fill="ECFDF5" w:val="clear"/>
+            <w:shd w:val="clear" w:color="auto" w:fill="ECFDF5"/>
             <w:tcMar>
-              <w:top w:type="dxa" w:w="120"/>
-              <w:left w:type="dxa" w:w="150"/>
-              <w:bottom w:type="dxa" w:w="120"/>
-              <w:right w:type="dxa" w:w="150"/>
+              <w:top w:w="120" w:type="dxa"/>
+              <w:left w:w="150" w:type="dxa"/>
+              <w:bottom w:w="120" w:type="dxa"/>
+              <w:right w:w="150" w:type="dxa"/>
             </w:tcMar>
           </w:tcPr>
           <w:p>
@@ -654,7 +680,7 @@
                 <w:sz w:val="32"/>
                 <w:szCs w:val="32"/>
               </w:rPr>
-              <w:t xml:space="preserve">💎</w:t>
+              <w:t>💎</w:t>
             </w:r>
           </w:p>
           <w:p>
@@ -664,13 +690,12 @@
             </w:pPr>
             <w:r>
               <w:rPr>
-                <w:rFonts w:ascii="Arial" w:cs="Arial" w:eastAsia="Arial" w:hAnsi="Arial"/>
                 <w:b/>
                 <w:bCs/>
                 <w:sz w:val="20"/>
                 <w:szCs w:val="20"/>
               </w:rPr>
-              <w:t xml:space="preserve">Donor Profile</w:t>
+              <w:t>Donor Profile</w:t>
             </w:r>
           </w:p>
           <w:p>
@@ -680,29 +705,29 @@
             </w:pPr>
             <w:r>
               <w:rPr>
-                <w:rFonts w:ascii="Arial" w:cs="Arial" w:eastAsia="Arial" w:hAnsi="Arial"/>
                 <w:color w:val="6B7280"/>
                 <w:sz w:val="18"/>
                 <w:szCs w:val="18"/>
               </w:rPr>
-              <w:t xml:space="preserve">Identitas, preferensi cause, risk profile</w:t>
+              <w:t>Identitas, preferensi cause, risk profile</w:t>
             </w:r>
           </w:p>
         </w:tc>
         <w:tc>
           <w:tcPr>
+            <w:tcW w:w="0" w:type="auto"/>
             <w:tcBorders>
-              <w:top w:val="single" w:color="E5E7EB" w:sz="1"/>
-              <w:left w:val="single" w:color="E5E7EB" w:sz="1"/>
-              <w:bottom w:val="single" w:color="E5E7EB" w:sz="1"/>
-              <w:right w:val="single" w:color="E5E7EB" w:sz="1"/>
+              <w:top w:val="single" w:sz="1" w:space="0" w:color="E5E7EB"/>
+              <w:left w:val="single" w:sz="1" w:space="0" w:color="E5E7EB"/>
+              <w:bottom w:val="single" w:sz="1" w:space="0" w:color="E5E7EB"/>
+              <w:right w:val="single" w:sz="1" w:space="0" w:color="E5E7EB"/>
             </w:tcBorders>
-            <w:shd w:fill="FEF3C7" w:val="clear"/>
+            <w:shd w:val="clear" w:color="auto" w:fill="FEF3C7"/>
             <w:tcMar>
-              <w:top w:type="dxa" w:w="120"/>
-              <w:left w:type="dxa" w:w="150"/>
-              <w:bottom w:type="dxa" w:w="120"/>
-              <w:right w:type="dxa" w:w="150"/>
+              <w:top w:w="120" w:type="dxa"/>
+              <w:left w:w="150" w:type="dxa"/>
+              <w:bottom w:w="120" w:type="dxa"/>
+              <w:right w:w="150" w:type="dxa"/>
             </w:tcMar>
           </w:tcPr>
           <w:p>
@@ -714,7 +739,7 @@
                 <w:sz w:val="32"/>
                 <w:szCs w:val="32"/>
               </w:rPr>
-              <w:t xml:space="preserve">📈</w:t>
+              <w:t>📈</w:t>
             </w:r>
           </w:p>
           <w:p>
@@ -724,13 +749,12 @@
             </w:pPr>
             <w:r>
               <w:rPr>
-                <w:rFonts w:ascii="Arial" w:cs="Arial" w:eastAsia="Arial" w:hAnsi="Arial"/>
                 <w:b/>
                 <w:bCs/>
                 <w:sz w:val="20"/>
                 <w:szCs w:val="20"/>
               </w:rPr>
-              <w:t xml:space="preserve">Financial Data</w:t>
+              <w:t>Financial Data</w:t>
             </w:r>
           </w:p>
           <w:p>
@@ -740,29 +764,29 @@
             </w:pPr>
             <w:r>
               <w:rPr>
-                <w:rFonts w:ascii="Arial" w:cs="Arial" w:eastAsia="Arial" w:hAnsi="Arial"/>
                 <w:color w:val="6B7280"/>
                 <w:sz w:val="18"/>
                 <w:szCs w:val="18"/>
               </w:rPr>
-              <w:t xml:space="preserve">Sukuk yield, audit trail, fee structure</w:t>
+              <w:t>Sukuk yield, audit trail, fee structure</w:t>
             </w:r>
           </w:p>
         </w:tc>
         <w:tc>
           <w:tcPr>
+            <w:tcW w:w="0" w:type="auto"/>
             <w:tcBorders>
-              <w:top w:val="single" w:color="E5E7EB" w:sz="1"/>
-              <w:left w:val="single" w:color="E5E7EB" w:sz="1"/>
-              <w:bottom w:val="single" w:color="E5E7EB" w:sz="1"/>
-              <w:right w:val="single" w:color="E5E7EB" w:sz="1"/>
+              <w:top w:val="single" w:sz="1" w:space="0" w:color="E5E7EB"/>
+              <w:left w:val="single" w:sz="1" w:space="0" w:color="E5E7EB"/>
+              <w:bottom w:val="single" w:sz="1" w:space="0" w:color="E5E7EB"/>
+              <w:right w:val="single" w:sz="1" w:space="0" w:color="E5E7EB"/>
             </w:tcBorders>
-            <w:shd w:fill="FEE2E2" w:val="clear"/>
+            <w:shd w:val="clear" w:color="auto" w:fill="FEE2E2"/>
             <w:tcMar>
-              <w:top w:type="dxa" w:w="120"/>
-              <w:left w:type="dxa" w:w="150"/>
-              <w:bottom w:type="dxa" w:w="120"/>
-              <w:right w:type="dxa" w:w="150"/>
+              <w:top w:w="120" w:type="dxa"/>
+              <w:left w:w="150" w:type="dxa"/>
+              <w:bottom w:w="120" w:type="dxa"/>
+              <w:right w:w="150" w:type="dxa"/>
             </w:tcMar>
           </w:tcPr>
           <w:p>
@@ -774,7 +798,7 @@
                 <w:sz w:val="32"/>
                 <w:szCs w:val="32"/>
               </w:rPr>
-              <w:t xml:space="preserve">❤️</w:t>
+              <w:t>❤️</w:t>
             </w:r>
           </w:p>
           <w:p>
@@ -784,13 +808,12 @@
             </w:pPr>
             <w:r>
               <w:rPr>
-                <w:rFonts w:ascii="Arial" w:cs="Arial" w:eastAsia="Arial" w:hAnsi="Arial"/>
                 <w:b/>
                 <w:bCs/>
                 <w:sz w:val="20"/>
                 <w:szCs w:val="20"/>
               </w:rPr>
-              <w:t xml:space="preserve">Impact Data</w:t>
+              <w:t>Impact Data</w:t>
             </w:r>
           </w:p>
           <w:p>
@@ -800,12 +823,11 @@
             </w:pPr>
             <w:r>
               <w:rPr>
-                <w:rFonts w:ascii="Arial" w:cs="Arial" w:eastAsia="Arial" w:hAnsi="Arial"/>
                 <w:color w:val="6B7280"/>
                 <w:sz w:val="18"/>
                 <w:szCs w:val="18"/>
               </w:rPr>
-              <w:t xml:space="preserve">Field reports, beneficiary stories, media</w:t>
+              <w:t>Field reports, beneficiary stories, media</w:t>
             </w:r>
           </w:p>
         </w:tc>
@@ -816,30 +838,17 @@
         <w:spacing w:before="200"/>
       </w:pPr>
       <w:r>
+        <w:t xml:space="preserve">AI Agent (Aminah) melakukan retrieval dari ketiga layer ini untuk memberikan respons yang </w:t>
+      </w:r>
+      <w:r>
         <w:rPr>
-          <w:rFonts w:ascii="Arial" w:cs="Arial" w:eastAsia="Arial" w:hAnsi="Arial"/>
-          <w:sz w:val="22"/>
-          <w:szCs w:val="22"/>
-        </w:rPr>
-        <w:t xml:space="preserve">AI Agent (Aminah) melakukan retrieval dari ketiga layer ini untuk memberikan respons yang </w:t>
-      </w:r>
-      <w:r>
-        <w:rPr>
-          <w:rFonts w:ascii="Arial" w:cs="Arial" w:eastAsia="Arial" w:hAnsi="Arial"/>
           <w:b/>
           <w:bCs/>
-          <w:sz w:val="22"/>
-          <w:szCs w:val="22"/>
         </w:rPr>
-        <w:t xml:space="preserve">grounded, personal, dan auditable</w:t>
-      </w:r>
-      <w:r>
-        <w:rPr>
-          <w:rFonts w:ascii="Arial" w:cs="Arial" w:eastAsia="Arial" w:hAnsi="Arial"/>
-          <w:sz w:val="22"/>
-          <w:szCs w:val="22"/>
-        </w:rPr>
-        <w:t xml:space="preserve">.</w:t>
+        <w:t>grounded, personal, dan auditable</w:t>
+      </w:r>
+      <w:r>
+        <w:t>.</w:t>
       </w:r>
     </w:p>
     <w:p>
@@ -852,38 +861,50 @@
         <w:pStyle w:val="Heading1"/>
       </w:pPr>
       <w:r>
-        <w:t xml:space="preserve">3. Prinsip Utama AI Agent</w:t>
+        <w:t>3. Prinsip Utama AI Agent</w:t>
       </w:r>
     </w:p>
     <w:tbl>
       <w:tblPr>
-        <w:tblW w:type="pct" w:w="100%"/>
+        <w:tblW w:w="5000" w:type="pct"/>
         <w:tblBorders>
-          <w:top w:val="single" w:color="auto" w:sz="4"/>
-          <w:left w:val="single" w:color="auto" w:sz="4"/>
-          <w:bottom w:val="single" w:color="auto" w:sz="4"/>
-          <w:right w:val="single" w:color="auto" w:sz="4"/>
-          <w:insideH w:val="single" w:color="auto" w:sz="4"/>
-          <w:insideV w:val="single" w:color="auto" w:sz="4"/>
+          <w:top w:val="single" w:sz="4" w:space="0" w:color="auto"/>
+          <w:left w:val="single" w:sz="4" w:space="0" w:color="auto"/>
+          <w:bottom w:val="single" w:sz="4" w:space="0" w:color="auto"/>
+          <w:right w:val="single" w:sz="4" w:space="0" w:color="auto"/>
+          <w:insideH w:val="single" w:sz="4" w:space="0" w:color="auto"/>
+          <w:insideV w:val="single" w:sz="4" w:space="0" w:color="auto"/>
         </w:tblBorders>
+        <w:tblCellMar>
+          <w:left w:w="10" w:type="dxa"/>
+          <w:right w:w="10" w:type="dxa"/>
+        </w:tblCellMar>
+        <w:tblLook w:val="0000" w:firstRow="0" w:lastRow="0" w:firstColumn="0" w:lastColumn="0" w:noHBand="0" w:noVBand="0"/>
       </w:tblPr>
       <w:tblGrid>
-        <w:gridCol w:w="9360"/>
+        <w:gridCol w:w="9358"/>
       </w:tblGrid>
       <w:tr>
+        <w:tblPrEx>
+          <w:tblCellMar>
+            <w:top w:w="0" w:type="dxa"/>
+            <w:bottom w:w="0" w:type="dxa"/>
+          </w:tblCellMar>
+        </w:tblPrEx>
         <w:tc>
           <w:tcPr>
+            <w:tcW w:w="0" w:type="auto"/>
             <w:tcBorders>
-              <w:top w:val="single" w:color="E5E7EB" w:sz="1"/>
-              <w:left w:val="single" w:color="E5E7EB" w:sz="1"/>
-              <w:bottom w:val="single" w:color="E5E7EB" w:sz="1"/>
-              <w:right w:val="single" w:color="E5E7EB" w:sz="1"/>
+              <w:top w:val="single" w:sz="1" w:space="0" w:color="E5E7EB"/>
+              <w:left w:val="single" w:sz="1" w:space="0" w:color="E5E7EB"/>
+              <w:bottom w:val="single" w:sz="1" w:space="0" w:color="E5E7EB"/>
+              <w:right w:val="single" w:sz="1" w:space="0" w:color="E5E7EB"/>
             </w:tcBorders>
             <w:tcMar>
-              <w:top w:type="dxa" w:w="100"/>
-              <w:left w:type="dxa" w:w="150"/>
-              <w:bottom w:type="dxa" w:w="100"/>
-              <w:right w:type="dxa" w:w="150"/>
+              <w:top w:w="100" w:type="dxa"/>
+              <w:left w:w="150" w:type="dxa"/>
+              <w:bottom w:w="100" w:type="dxa"/>
+              <w:right w:w="150" w:type="dxa"/>
             </w:tcMar>
           </w:tcPr>
           <w:p>
@@ -892,43 +913,46 @@
             </w:pPr>
             <w:r>
               <w:rPr>
-                <w:rFonts w:ascii="Arial" w:cs="Arial" w:eastAsia="Arial" w:hAnsi="Arial"/>
                 <w:b/>
                 <w:bCs/>
                 <w:color w:val="1F2937"/>
-                <w:sz w:val="22"/>
-                <w:szCs w:val="22"/>
-              </w:rPr>
-              <w:t xml:space="preserve">🔒 Never Hallucinate</w:t>
-            </w:r>
-          </w:p>
-          <w:p>
-            <w:r>
-              <w:rPr>
-                <w:rFonts w:ascii="Arial" w:cs="Arial" w:eastAsia="Arial" w:hAnsi="Arial"/>
+              </w:rPr>
+              <w:t>🔒 Never Hallucinate</w:t>
+            </w:r>
+          </w:p>
+          <w:p>
+            <w:r>
+              <w:rPr>
                 <w:color w:val="6B7280"/>
                 <w:sz w:val="20"/>
                 <w:szCs w:val="20"/>
               </w:rPr>
-              <w:t xml:space="preserve">AI TIDAK PERNAH mengarang angka finansial. Setiap figur harus mengutip audit_report_id atau field_report_id yang valid.</w:t>
+              <w:t>AI TIDAK PERNAH mengarang angka finansial. Setiap figur harus mengutip audit_report_id atau field_report_id yang valid.</w:t>
             </w:r>
           </w:p>
         </w:tc>
       </w:tr>
       <w:tr>
+        <w:tblPrEx>
+          <w:tblCellMar>
+            <w:top w:w="0" w:type="dxa"/>
+            <w:bottom w:w="0" w:type="dxa"/>
+          </w:tblCellMar>
+        </w:tblPrEx>
         <w:tc>
           <w:tcPr>
+            <w:tcW w:w="0" w:type="auto"/>
             <w:tcBorders>
-              <w:top w:val="single" w:color="E5E7EB" w:sz="1"/>
-              <w:left w:val="single" w:color="E5E7EB" w:sz="1"/>
-              <w:bottom w:val="single" w:color="E5E7EB" w:sz="1"/>
-              <w:right w:val="single" w:color="E5E7EB" w:sz="1"/>
+              <w:top w:val="single" w:sz="1" w:space="0" w:color="E5E7EB"/>
+              <w:left w:val="single" w:sz="1" w:space="0" w:color="E5E7EB"/>
+              <w:bottom w:val="single" w:sz="1" w:space="0" w:color="E5E7EB"/>
+              <w:right w:val="single" w:sz="1" w:space="0" w:color="E5E7EB"/>
             </w:tcBorders>
             <w:tcMar>
-              <w:top w:type="dxa" w:w="100"/>
-              <w:left w:type="dxa" w:w="150"/>
-              <w:bottom w:type="dxa" w:w="100"/>
-              <w:right w:type="dxa" w:w="150"/>
+              <w:top w:w="100" w:type="dxa"/>
+              <w:left w:w="150" w:type="dxa"/>
+              <w:bottom w:w="100" w:type="dxa"/>
+              <w:right w:w="150" w:type="dxa"/>
             </w:tcMar>
           </w:tcPr>
           <w:p>
@@ -937,43 +961,46 @@
             </w:pPr>
             <w:r>
               <w:rPr>
-                <w:rFonts w:ascii="Arial" w:cs="Arial" w:eastAsia="Arial" w:hAnsi="Arial"/>
                 <w:b/>
                 <w:bCs/>
                 <w:color w:val="1F2937"/>
-                <w:sz w:val="22"/>
-                <w:szCs w:val="22"/>
-              </w:rPr>
-              <w:t xml:space="preserve">✨ Barakah-Focused</w:t>
-            </w:r>
-          </w:p>
-          <w:p>
-            <w:r>
-              <w:rPr>
-                <w:rFonts w:ascii="Arial" w:cs="Arial" w:eastAsia="Arial" w:hAnsi="Arial"/>
+              </w:rPr>
+              <w:t>✨ Barakah-Focused</w:t>
+            </w:r>
+          </w:p>
+          <w:p>
+            <w:r>
+              <w:rPr>
                 <w:color w:val="6B7280"/>
                 <w:sz w:val="20"/>
                 <w:szCs w:val="20"/>
               </w:rPr>
-              <w:t xml:space="preserve">Komunikasi membingkai dampak dalam perspektif spiritual — sadaqah jariyah, perpetual dividend, river of continuous reward.</w:t>
+              <w:t>Komunikasi membingkai dampak dalam perspektif spiritual — sadaqah jariyah, perpetual dividend, river of continuous reward.</w:t>
             </w:r>
           </w:p>
         </w:tc>
       </w:tr>
       <w:tr>
+        <w:tblPrEx>
+          <w:tblCellMar>
+            <w:top w:w="0" w:type="dxa"/>
+            <w:bottom w:w="0" w:type="dxa"/>
+          </w:tblCellMar>
+        </w:tblPrEx>
         <w:tc>
           <w:tcPr>
+            <w:tcW w:w="0" w:type="auto"/>
             <w:tcBorders>
-              <w:top w:val="single" w:color="E5E7EB" w:sz="1"/>
-              <w:left w:val="single" w:color="E5E7EB" w:sz="1"/>
-              <w:bottom w:val="single" w:color="E5E7EB" w:sz="1"/>
-              <w:right w:val="single" w:color="E5E7EB" w:sz="1"/>
+              <w:top w:val="single" w:sz="1" w:space="0" w:color="E5E7EB"/>
+              <w:left w:val="single" w:sz="1" w:space="0" w:color="E5E7EB"/>
+              <w:bottom w:val="single" w:sz="1" w:space="0" w:color="E5E7EB"/>
+              <w:right w:val="single" w:sz="1" w:space="0" w:color="E5E7EB"/>
             </w:tcBorders>
             <w:tcMar>
-              <w:top w:type="dxa" w:w="100"/>
-              <w:left w:type="dxa" w:w="150"/>
-              <w:bottom w:type="dxa" w:w="100"/>
-              <w:right w:type="dxa" w:w="150"/>
+              <w:top w:w="100" w:type="dxa"/>
+              <w:left w:w="150" w:type="dxa"/>
+              <w:bottom w:w="100" w:type="dxa"/>
+              <w:right w:w="150" w:type="dxa"/>
             </w:tcMar>
           </w:tcPr>
           <w:p>
@@ -982,43 +1009,46 @@
             </w:pPr>
             <w:r>
               <w:rPr>
-                <w:rFonts w:ascii="Arial" w:cs="Arial" w:eastAsia="Arial" w:hAnsi="Arial"/>
                 <w:b/>
                 <w:bCs/>
                 <w:color w:val="1F2937"/>
-                <w:sz w:val="22"/>
-                <w:szCs w:val="22"/>
-              </w:rPr>
-              <w:t xml:space="preserve">📊 Data-Driven Transparency</w:t>
-            </w:r>
-          </w:p>
-          <w:p>
-            <w:r>
-              <w:rPr>
-                <w:rFonts w:ascii="Arial" w:cs="Arial" w:eastAsia="Arial" w:hAnsi="Arial"/>
+              </w:rPr>
+              <w:t>📊 Data-Driven Transparency</w:t>
+            </w:r>
+          </w:p>
+          <w:p>
+            <w:r>
+              <w:rPr>
                 <w:color w:val="6B7280"/>
                 <w:sz w:val="20"/>
                 <w:szCs w:val="20"/>
               </w:rPr>
-              <w:t xml:space="preserve">Pertanyaan GRC (Governance, Risk, Compliance) dijawab dengan breakdown fee lengkap dan akses ke audit report.</w:t>
+              <w:t>Pertanyaan GRC (Governance, Risk, Compliance) dijawab dengan breakdown fee lengkap dan akses ke audit report.</w:t>
             </w:r>
           </w:p>
         </w:tc>
       </w:tr>
       <w:tr>
+        <w:tblPrEx>
+          <w:tblCellMar>
+            <w:top w:w="0" w:type="dxa"/>
+            <w:bottom w:w="0" w:type="dxa"/>
+          </w:tblCellMar>
+        </w:tblPrEx>
         <w:tc>
           <w:tcPr>
+            <w:tcW w:w="0" w:type="auto"/>
             <w:tcBorders>
-              <w:top w:val="single" w:color="E5E7EB" w:sz="1"/>
-              <w:left w:val="single" w:color="E5E7EB" w:sz="1"/>
-              <w:bottom w:val="single" w:color="E5E7EB" w:sz="1"/>
-              <w:right w:val="single" w:color="E5E7EB" w:sz="1"/>
+              <w:top w:val="single" w:sz="1" w:space="0" w:color="E5E7EB"/>
+              <w:left w:val="single" w:sz="1" w:space="0" w:color="E5E7EB"/>
+              <w:bottom w:val="single" w:sz="1" w:space="0" w:color="E5E7EB"/>
+              <w:right w:val="single" w:sz="1" w:space="0" w:color="E5E7EB"/>
             </w:tcBorders>
             <w:tcMar>
-              <w:top w:type="dxa" w:w="100"/>
-              <w:left w:type="dxa" w:w="150"/>
-              <w:bottom w:type="dxa" w:w="100"/>
-              <w:right w:type="dxa" w:w="150"/>
+              <w:top w:w="100" w:type="dxa"/>
+              <w:left w:w="150" w:type="dxa"/>
+              <w:bottom w:w="100" w:type="dxa"/>
+              <w:right w:w="150" w:type="dxa"/>
             </w:tcMar>
           </w:tcPr>
           <w:p>
@@ -1027,25 +1057,21 @@
             </w:pPr>
             <w:r>
               <w:rPr>
-                <w:rFonts w:ascii="Arial" w:cs="Arial" w:eastAsia="Arial" w:hAnsi="Arial"/>
                 <w:b/>
                 <w:bCs/>
                 <w:color w:val="1F2937"/>
-                <w:sz w:val="22"/>
-                <w:szCs w:val="22"/>
-              </w:rPr>
-              <w:t xml:space="preserve">🎯 Visual Language</w:t>
-            </w:r>
-          </w:p>
-          <w:p>
-            <w:r>
-              <w:rPr>
-                <w:rFonts w:ascii="Arial" w:cs="Arial" w:eastAsia="Arial" w:hAnsi="Arial"/>
+              </w:rPr>
+              <w:t>🎯 Visual Language</w:t>
+            </w:r>
+          </w:p>
+          <w:p>
+            <w:r>
+              <w:rPr>
                 <w:color w:val="6B7280"/>
                 <w:sz w:val="20"/>
                 <w:szCs w:val="20"/>
               </w:rPr>
-              <w:t xml:space="preserve">Cerita impact menggunakan bahasa deskriptif yang membuat donor "merasakan" kehadiran di lapangan.</w:t>
+              <w:t>Cerita impact menggunakan bahasa deskriptif yang membuat donor "merasakan" kehadiran di lapangan.</w:t>
             </w:r>
           </w:p>
         </w:tc>
@@ -1058,10 +1084,15 @@
     </w:p>
     <w:p>
       <w:pPr>
+        <w:spacing w:before="300"/>
+      </w:pPr>
+    </w:p>
+    <w:p>
+      <w:pPr>
         <w:pStyle w:val="Heading1"/>
       </w:pPr>
       <w:r>
-        <w:t xml:space="preserve">4. Contoh Skenario Percakapan</w:t>
+        <w:t>4. Contoh Skenario Percakapan</w:t>
       </w:r>
     </w:p>
     <w:p>
@@ -1069,45 +1100,50 @@
         <w:pStyle w:val="Heading3"/>
       </w:pPr>
       <w:r>
-        <w:t xml:space="preserve">Skenario A: Pertanyaan Audit</w:t>
+        <w:t>Skenario A: Pertanyaan Audit</w:t>
       </w:r>
     </w:p>
     <w:tbl>
       <w:tblPr>
-        <w:tblW w:type="pct" w:w="100%"/>
+        <w:tblW w:w="5000" w:type="pct"/>
         <w:tblBorders>
-          <w:top w:val="single" w:color="auto" w:sz="4"/>
-          <w:left w:val="single" w:color="auto" w:sz="4"/>
-          <w:bottom w:val="single" w:color="auto" w:sz="4"/>
-          <w:right w:val="single" w:color="auto" w:sz="4"/>
-          <w:insideH w:val="single" w:color="auto" w:sz="4"/>
-          <w:insideV w:val="single" w:color="auto" w:sz="4"/>
+          <w:top w:val="single" w:sz="4" w:space="0" w:color="auto"/>
+          <w:left w:val="single" w:sz="4" w:space="0" w:color="auto"/>
+          <w:bottom w:val="single" w:sz="4" w:space="0" w:color="auto"/>
+          <w:right w:val="single" w:sz="4" w:space="0" w:color="auto"/>
+          <w:insideH w:val="single" w:sz="4" w:space="0" w:color="auto"/>
+          <w:insideV w:val="single" w:sz="4" w:space="0" w:color="auto"/>
         </w:tblBorders>
+        <w:tblCellMar>
+          <w:left w:w="10" w:type="dxa"/>
+          <w:right w:w="10" w:type="dxa"/>
+        </w:tblCellMar>
+        <w:tblLook w:val="0000" w:firstRow="0" w:lastRow="0" w:firstColumn="0" w:lastColumn="0" w:noHBand="0" w:noVBand="0"/>
       </w:tblPr>
       <w:tblGrid>
-        <w:gridCol w:w="9360"/>
+        <w:gridCol w:w="9350"/>
       </w:tblGrid>
       <w:tr>
+        <w:tblPrEx>
+          <w:tblCellMar>
+            <w:top w:w="0" w:type="dxa"/>
+            <w:bottom w:w="0" w:type="dxa"/>
+          </w:tblCellMar>
+        </w:tblPrEx>
         <w:tc>
           <w:tcPr>
-            <w:tcBorders>
-              <w:top w:val="none"/>
-              <w:left w:val="none"/>
-              <w:bottom w:val="none"/>
-              <w:right w:val="none"/>
-            </w:tcBorders>
-            <w:shd w:fill="F3F4F6" w:val="clear"/>
+            <w:tcW w:w="0" w:type="auto"/>
+            <w:shd w:val="clear" w:color="auto" w:fill="F3F4F6"/>
             <w:tcMar>
-              <w:top w:type="dxa" w:w="120"/>
-              <w:left w:type="dxa" w:w="200"/>
-              <w:bottom w:type="dxa" w:w="120"/>
-              <w:right w:type="dxa" w:w="200"/>
+              <w:top w:w="120" w:type="dxa"/>
+              <w:left w:w="200" w:type="dxa"/>
+              <w:bottom w:w="120" w:type="dxa"/>
+              <w:right w:w="200" w:type="dxa"/>
             </w:tcMar>
           </w:tcPr>
           <w:p>
             <w:r>
               <w:rPr>
-                <w:rFonts w:ascii="Arial" w:cs="Arial" w:eastAsia="Arial" w:hAnsi="Arial"/>
                 <w:b/>
                 <w:bCs/>
                 <w:sz w:val="20"/>
@@ -1117,13 +1153,12 @@
             </w:r>
             <w:r>
               <w:rPr>
-                <w:rFonts w:ascii="Arial" w:cs="Arial" w:eastAsia="Arial" w:hAnsi="Arial"/>
                 <w:i/>
                 <w:iCs/>
                 <w:sz w:val="20"/>
                 <w:szCs w:val="20"/>
               </w:rPr>
-              <w:t xml:space="preserve">"Bagaimana saya tahu uang ini tidak dimakan admin fee atau korupsi?"</w:t>
+              <w:t>"Bagaimana saya tahu uang ini tidak dimakan admin fee atau korupsi?"</w:t>
             </w:r>
           </w:p>
           <w:p>
@@ -1132,7 +1167,6 @@
             </w:pPr>
             <w:r>
               <w:rPr>
-                <w:rFonts w:ascii="Arial" w:cs="Arial" w:eastAsia="Arial" w:hAnsi="Arial"/>
                 <w:b/>
                 <w:bCs/>
                 <w:color w:val="10B981"/>
@@ -1143,11 +1177,10 @@
             </w:r>
             <w:r>
               <w:rPr>
-                <w:rFonts w:ascii="Arial" w:cs="Arial" w:eastAsia="Arial" w:hAnsi="Arial"/>
-                <w:sz w:val="20"/>
-                <w:szCs w:val="20"/>
-              </w:rPr>
-              <w:t xml:space="preserve">Memberikan breakdown lengkap: Gross Yield $7,350 → Management Fee 5% ($367.50) → Sharia Audit 1% ($73.50) → Net Deployed $6,909 (94%). Menyertakan link ke KPMG Audit Report.</w:t>
+                <w:sz w:val="20"/>
+                <w:szCs w:val="20"/>
+              </w:rPr>
+              <w:t>Memberikan breakdown lengkap: Gross Yield $7,350 → Management Fee 5% ($367.50) → Sharia Audit 1% ($73.50) → Net Deployed $6,909 (94%). Menyertakan link ke KPMG Audit Report.</w:t>
             </w:r>
           </w:p>
         </w:tc>
@@ -1156,48 +1189,53 @@
     <w:p>
       <w:pPr>
         <w:pStyle w:val="Heading3"/>
-        <w:spacing w:before="200"/>
-      </w:pPr>
-      <w:r>
-        <w:t xml:space="preserve">Skenario B: Simulasi Reinvestasi</w:t>
+      </w:pPr>
+      <w:r>
+        <w:lastRenderedPageBreak/>
+        <w:t>Skenario B: Simulasi Reinvestasi</w:t>
       </w:r>
     </w:p>
     <w:tbl>
       <w:tblPr>
-        <w:tblW w:type="pct" w:w="100%"/>
+        <w:tblW w:w="5000" w:type="pct"/>
         <w:tblBorders>
-          <w:top w:val="single" w:color="auto" w:sz="4"/>
-          <w:left w:val="single" w:color="auto" w:sz="4"/>
-          <w:bottom w:val="single" w:color="auto" w:sz="4"/>
-          <w:right w:val="single" w:color="auto" w:sz="4"/>
-          <w:insideH w:val="single" w:color="auto" w:sz="4"/>
-          <w:insideV w:val="single" w:color="auto" w:sz="4"/>
+          <w:top w:val="single" w:sz="4" w:space="0" w:color="auto"/>
+          <w:left w:val="single" w:sz="4" w:space="0" w:color="auto"/>
+          <w:bottom w:val="single" w:sz="4" w:space="0" w:color="auto"/>
+          <w:right w:val="single" w:sz="4" w:space="0" w:color="auto"/>
+          <w:insideH w:val="single" w:sz="4" w:space="0" w:color="auto"/>
+          <w:insideV w:val="single" w:sz="4" w:space="0" w:color="auto"/>
         </w:tblBorders>
+        <w:tblCellMar>
+          <w:left w:w="10" w:type="dxa"/>
+          <w:right w:w="10" w:type="dxa"/>
+        </w:tblCellMar>
+        <w:tblLook w:val="0000" w:firstRow="0" w:lastRow="0" w:firstColumn="0" w:lastColumn="0" w:noHBand="0" w:noVBand="0"/>
       </w:tblPr>
       <w:tblGrid>
-        <w:gridCol w:w="9360"/>
+        <w:gridCol w:w="9350"/>
       </w:tblGrid>
       <w:tr>
+        <w:tblPrEx>
+          <w:tblCellMar>
+            <w:top w:w="0" w:type="dxa"/>
+            <w:bottom w:w="0" w:type="dxa"/>
+          </w:tblCellMar>
+        </w:tblPrEx>
         <w:tc>
           <w:tcPr>
-            <w:tcBorders>
-              <w:top w:val="none"/>
-              <w:left w:val="none"/>
-              <w:bottom w:val="none"/>
-              <w:right w:val="none"/>
-            </w:tcBorders>
-            <w:shd w:fill="FEF3C7" w:val="clear"/>
+            <w:tcW w:w="0" w:type="auto"/>
+            <w:shd w:val="clear" w:color="auto" w:fill="FEF3C7"/>
             <w:tcMar>
-              <w:top w:type="dxa" w:w="120"/>
-              <w:left w:type="dxa" w:w="200"/>
-              <w:bottom w:type="dxa" w:w="120"/>
-              <w:right w:type="dxa" w:w="200"/>
+              <w:top w:w="120" w:type="dxa"/>
+              <w:left w:w="200" w:type="dxa"/>
+              <w:bottom w:w="120" w:type="dxa"/>
+              <w:right w:w="200" w:type="dxa"/>
             </w:tcMar>
           </w:tcPr>
           <w:p>
             <w:r>
               <w:rPr>
-                <w:rFonts w:ascii="Arial" w:cs="Arial" w:eastAsia="Arial" w:hAnsi="Arial"/>
                 <w:b/>
                 <w:bCs/>
                 <w:sz w:val="20"/>
@@ -1207,13 +1245,12 @@
             </w:r>
             <w:r>
               <w:rPr>
-                <w:rFonts w:ascii="Arial" w:cs="Arial" w:eastAsia="Arial" w:hAnsi="Arial"/>
                 <w:i/>
                 <w:iCs/>
                 <w:sz w:val="20"/>
                 <w:szCs w:val="20"/>
               </w:rPr>
-              <w:t xml:space="preserve">"Kalau saya tambah $10k, apa yang terjadi?"</w:t>
+              <w:t>"Kalau saya tambah $10k, apa yang terjadi?"</w:t>
             </w:r>
           </w:p>
           <w:p>
@@ -1222,7 +1259,6 @@
             </w:pPr>
             <w:r>
               <w:rPr>
-                <w:rFonts w:ascii="Arial" w:cs="Arial" w:eastAsia="Arial" w:hAnsi="Arial"/>
                 <w:b/>
                 <w:bCs/>
                 <w:color w:val="10B981"/>
@@ -1233,11 +1269,10 @@
             </w:r>
             <w:r>
               <w:rPr>
-                <w:rFonts w:ascii="Arial" w:cs="Arial" w:eastAsia="Arial" w:hAnsi="Arial"/>
-                <w:sz w:val="20"/>
-                <w:szCs w:val="20"/>
-              </w:rPr>
-              <w:t xml:space="preserve">Menghitung: $10k × 5.8% yield = $580/tahun → setelah 6% overhead = $545 net. Dampak: 1 anak teredukasi penuh per tahun. Dalam 10 tahun: 15-16 beneficiary tanpa menyentuh principal.</w:t>
+                <w:sz w:val="20"/>
+                <w:szCs w:val="20"/>
+              </w:rPr>
+              <w:t>Menghitung: $10k × 5.8% yield = $580/tahun → setelah 6% overhead = $545 net. Dampak: 1 anak teredukasi penuh per tahun. Dalam 10 tahun: 15-16 beneficiary tanpa menyentuh principal.</w:t>
             </w:r>
           </w:p>
         </w:tc>
@@ -1253,52 +1288,63 @@
         <w:pStyle w:val="Heading1"/>
       </w:pPr>
       <w:r>
-        <w:t xml:space="preserve">5. Teknologi &amp; Kepatuhan</w:t>
+        <w:t>5. Teknologi &amp; Kepatuhan</w:t>
       </w:r>
     </w:p>
     <w:tbl>
       <w:tblPr>
-        <w:tblW w:type="pct" w:w="100%"/>
+        <w:tblW w:w="5000" w:type="pct"/>
         <w:tblBorders>
-          <w:top w:val="single" w:color="auto" w:sz="4"/>
-          <w:left w:val="single" w:color="auto" w:sz="4"/>
-          <w:bottom w:val="single" w:color="auto" w:sz="4"/>
-          <w:right w:val="single" w:color="auto" w:sz="4"/>
-          <w:insideH w:val="single" w:color="auto" w:sz="4"/>
-          <w:insideV w:val="single" w:color="auto" w:sz="4"/>
+          <w:top w:val="single" w:sz="4" w:space="0" w:color="auto"/>
+          <w:left w:val="single" w:sz="4" w:space="0" w:color="auto"/>
+          <w:bottom w:val="single" w:sz="4" w:space="0" w:color="auto"/>
+          <w:right w:val="single" w:sz="4" w:space="0" w:color="auto"/>
+          <w:insideH w:val="single" w:sz="4" w:space="0" w:color="auto"/>
+          <w:insideV w:val="single" w:sz="4" w:space="0" w:color="auto"/>
         </w:tblBorders>
+        <w:tblCellMar>
+          <w:left w:w="10" w:type="dxa"/>
+          <w:right w:w="10" w:type="dxa"/>
+        </w:tblCellMar>
+        <w:tblLook w:val="0000" w:firstRow="0" w:lastRow="0" w:firstColumn="0" w:lastColumn="0" w:noHBand="0" w:noVBand="0"/>
       </w:tblPr>
       <w:tblGrid>
-        <w:gridCol w:w="4680"/>
-        <w:gridCol w:w="4680"/>
+        <w:gridCol w:w="4605"/>
+        <w:gridCol w:w="4753"/>
       </w:tblGrid>
       <w:tr>
+        <w:tblPrEx>
+          <w:tblCellMar>
+            <w:top w:w="0" w:type="dxa"/>
+            <w:bottom w:w="0" w:type="dxa"/>
+          </w:tblCellMar>
+        </w:tblPrEx>
         <w:tc>
           <w:tcPr>
+            <w:tcW w:w="0" w:type="auto"/>
             <w:tcBorders>
-              <w:top w:val="single" w:color="E5E7EB" w:sz="1"/>
-              <w:left w:val="single" w:color="E5E7EB" w:sz="1"/>
-              <w:bottom w:val="single" w:color="E5E7EB" w:sz="1"/>
-              <w:right w:val="single" w:color="E5E7EB" w:sz="1"/>
+              <w:top w:val="single" w:sz="1" w:space="0" w:color="E5E7EB"/>
+              <w:left w:val="single" w:sz="1" w:space="0" w:color="E5E7EB"/>
+              <w:bottom w:val="single" w:sz="1" w:space="0" w:color="E5E7EB"/>
+              <w:right w:val="single" w:sz="1" w:space="0" w:color="E5E7EB"/>
             </w:tcBorders>
-            <w:shd w:fill="F9FAFB" w:val="clear"/>
+            <w:shd w:val="clear" w:color="auto" w:fill="F9FAFB"/>
             <w:tcMar>
-              <w:top w:type="dxa" w:w="100"/>
-              <w:left w:type="dxa" w:w="150"/>
-              <w:bottom w:type="dxa" w:w="100"/>
-              <w:right w:type="dxa" w:w="150"/>
+              <w:top w:w="100" w:type="dxa"/>
+              <w:left w:w="150" w:type="dxa"/>
+              <w:bottom w:w="100" w:type="dxa"/>
+              <w:right w:w="150" w:type="dxa"/>
             </w:tcMar>
           </w:tcPr>
           <w:p>
             <w:r>
               <w:rPr>
-                <w:rFonts w:ascii="Arial" w:cs="Arial" w:eastAsia="Arial" w:hAnsi="Arial"/>
                 <w:b/>
                 <w:bCs/>
                 <w:sz w:val="20"/>
                 <w:szCs w:val="20"/>
               </w:rPr>
-              <w:t xml:space="preserve">Technology Stack</w:t>
+              <w:t>Technology Stack</w:t>
             </w:r>
           </w:p>
           <w:p>
@@ -1307,44 +1353,40 @@
             </w:pPr>
             <w:r>
               <w:rPr>
-                <w:rFonts w:ascii="Arial" w:cs="Arial" w:eastAsia="Arial" w:hAnsi="Arial"/>
                 <w:color w:val="6B7280"/>
                 <w:sz w:val="18"/>
                 <w:szCs w:val="18"/>
               </w:rPr>
-              <w:t xml:space="preserve">• React.js Frontend
-• Agentic RAG Architecture
-• Vector Knowledge Graph
-• LLM Orchestration Layer</w:t>
+              <w:t>• React.js Frontend • Agentic RAG Architecture • Vector Knowledge Graph • LLM Orchestration Layer</w:t>
             </w:r>
           </w:p>
         </w:tc>
         <w:tc>
           <w:tcPr>
+            <w:tcW w:w="0" w:type="auto"/>
             <w:tcBorders>
-              <w:top w:val="single" w:color="E5E7EB" w:sz="1"/>
-              <w:left w:val="single" w:color="E5E7EB" w:sz="1"/>
-              <w:bottom w:val="single" w:color="E5E7EB" w:sz="1"/>
-              <w:right w:val="single" w:color="E5E7EB" w:sz="1"/>
+              <w:top w:val="single" w:sz="1" w:space="0" w:color="E5E7EB"/>
+              <w:left w:val="single" w:sz="1" w:space="0" w:color="E5E7EB"/>
+              <w:bottom w:val="single" w:sz="1" w:space="0" w:color="E5E7EB"/>
+              <w:right w:val="single" w:sz="1" w:space="0" w:color="E5E7EB"/>
             </w:tcBorders>
-            <w:shd w:fill="F9FAFB" w:val="clear"/>
+            <w:shd w:val="clear" w:color="auto" w:fill="F9FAFB"/>
             <w:tcMar>
-              <w:top w:type="dxa" w:w="100"/>
-              <w:left w:type="dxa" w:w="150"/>
-              <w:bottom w:type="dxa" w:w="100"/>
-              <w:right w:type="dxa" w:w="150"/>
+              <w:top w:w="100" w:type="dxa"/>
+              <w:left w:w="150" w:type="dxa"/>
+              <w:bottom w:w="100" w:type="dxa"/>
+              <w:right w:w="150" w:type="dxa"/>
             </w:tcMar>
           </w:tcPr>
           <w:p>
             <w:r>
               <w:rPr>
-                <w:rFonts w:ascii="Arial" w:cs="Arial" w:eastAsia="Arial" w:hAnsi="Arial"/>
                 <w:b/>
                 <w:bCs/>
                 <w:sz w:val="20"/>
                 <w:szCs w:val="20"/>
               </w:rPr>
-              <w:t xml:space="preserve">Compliance Framework</w:t>
+              <w:t>Compliance Framework</w:t>
             </w:r>
           </w:p>
           <w:p>
@@ -1353,15 +1395,11 @@
             </w:pPr>
             <w:r>
               <w:rPr>
-                <w:rFonts w:ascii="Arial" w:cs="Arial" w:eastAsia="Arial" w:hAnsi="Arial"/>
                 <w:color w:val="6B7280"/>
                 <w:sz w:val="18"/>
                 <w:szCs w:val="18"/>
               </w:rPr>
-              <w:t xml:space="preserve">• AAOIFI Sharia Standards
-• KPMG External Audit
-• ISO 27001 Data Security
-• GDPR/Privacy Compliant</w:t>
+              <w:t>• AAOIFI Sharia Standards • KPMG External Audit • ISO 27001 Data Security • GDPR/Privacy Compliant</w:t>
             </w:r>
           </w:p>
         </w:tc>
@@ -1374,34 +1412,40 @@
     </w:p>
     <w:tbl>
       <w:tblPr>
-        <w:tblW w:type="pct" w:w="100%"/>
+        <w:tblW w:w="5000" w:type="pct"/>
         <w:tblBorders>
-          <w:top w:val="single" w:color="auto" w:sz="4"/>
-          <w:left w:val="single" w:color="auto" w:sz="4"/>
-          <w:bottom w:val="single" w:color="auto" w:sz="4"/>
-          <w:right w:val="single" w:color="auto" w:sz="4"/>
-          <w:insideH w:val="single" w:color="auto" w:sz="4"/>
-          <w:insideV w:val="single" w:color="auto" w:sz="4"/>
+          <w:top w:val="single" w:sz="4" w:space="0" w:color="auto"/>
+          <w:left w:val="single" w:sz="4" w:space="0" w:color="auto"/>
+          <w:bottom w:val="single" w:sz="4" w:space="0" w:color="auto"/>
+          <w:right w:val="single" w:sz="4" w:space="0" w:color="auto"/>
+          <w:insideH w:val="single" w:sz="4" w:space="0" w:color="auto"/>
+          <w:insideV w:val="single" w:sz="4" w:space="0" w:color="auto"/>
         </w:tblBorders>
+        <w:tblCellMar>
+          <w:left w:w="10" w:type="dxa"/>
+          <w:right w:w="10" w:type="dxa"/>
+        </w:tblCellMar>
+        <w:tblLook w:val="0000" w:firstRow="0" w:lastRow="0" w:firstColumn="0" w:lastColumn="0" w:noHBand="0" w:noVBand="0"/>
       </w:tblPr>
       <w:tblGrid>
-        <w:gridCol w:w="9360"/>
+        <w:gridCol w:w="9350"/>
       </w:tblGrid>
       <w:tr>
+        <w:tblPrEx>
+          <w:tblCellMar>
+            <w:top w:w="0" w:type="dxa"/>
+            <w:bottom w:w="0" w:type="dxa"/>
+          </w:tblCellMar>
+        </w:tblPrEx>
         <w:tc>
           <w:tcPr>
-            <w:tcBorders>
-              <w:top w:val="none"/>
-              <w:left w:val="none"/>
-              <w:bottom w:val="none"/>
-              <w:right w:val="none"/>
-            </w:tcBorders>
-            <w:shd w:fill="065F46" w:val="clear"/>
+            <w:tcW w:w="0" w:type="auto"/>
+            <w:shd w:val="clear" w:color="auto" w:fill="065F46"/>
             <w:tcMar>
-              <w:top w:type="dxa" w:w="200"/>
-              <w:left w:type="dxa" w:w="300"/>
-              <w:bottom w:type="dxa" w:w="200"/>
-              <w:right w:type="dxa" w:w="300"/>
+              <w:top w:w="200" w:type="dxa"/>
+              <w:left w:w="300" w:type="dxa"/>
+              <w:bottom w:w="200" w:type="dxa"/>
+              <w:right w:w="300" w:type="dxa"/>
             </w:tcMar>
           </w:tcPr>
           <w:p>
@@ -1410,14 +1454,13 @@
             </w:pPr>
             <w:r>
               <w:rPr>
-                <w:rFonts w:ascii="Arial" w:cs="Arial" w:eastAsia="Arial" w:hAnsi="Arial"/>
                 <w:i/>
                 <w:iCs/>
                 <w:color w:val="FFFFFF"/>
                 <w:sz w:val="26"/>
                 <w:szCs w:val="26"/>
               </w:rPr>
-              <w:t xml:space="preserve">"Setiap interaksi adalah amanah."</w:t>
+              <w:t>"Setiap interaksi adalah amanah."</w:t>
             </w:r>
           </w:p>
           <w:p>
@@ -1427,12 +1470,11 @@
             </w:pPr>
             <w:r>
               <w:rPr>
-                <w:rFonts w:ascii="Arial" w:cs="Arial" w:eastAsia="Arial" w:hAnsi="Arial"/>
                 <w:color w:val="D1FAE5"/>
                 <w:sz w:val="20"/>
                 <w:szCs w:val="20"/>
               </w:rPr>
-              <w:t xml:space="preserve">GIFR Donor Concierge memastikan niat donor sampai ke tujuan dengan transparansi penuh.</w:t>
+              <w:t>GIFR Donor Concierge memastikan niat donor sampai ke tujuan dengan transparansi penuh.</w:t>
             </w:r>
           </w:p>
         </w:tc>
@@ -1449,7 +1491,6 @@
       </w:pPr>
       <w:r>
         <w:rPr>
-          <w:rFonts w:ascii="Arial" w:cs="Arial" w:eastAsia="Arial" w:hAnsi="Arial"/>
           <w:color w:val="6B7280"/>
           <w:sz w:val="18"/>
           <w:szCs w:val="18"/>
@@ -1458,18 +1499,16 @@
       </w:r>
       <w:r>
         <w:rPr>
-          <w:rFonts w:ascii="Arial" w:cs="Arial" w:eastAsia="Arial" w:hAnsi="Arial"/>
           <w:b/>
           <w:bCs/>
           <w:color w:val="6B7280"/>
           <w:sz w:val="18"/>
           <w:szCs w:val="18"/>
         </w:rPr>
-        <w:t xml:space="preserve">GIFR Technology Team</w:t>
+        <w:t>GIFR Technology Team</w:t>
       </w:r>
       <w:r>
         <w:rPr>
-          <w:rFonts w:ascii="Arial" w:cs="Arial" w:eastAsia="Arial" w:hAnsi="Arial"/>
           <w:color w:val="6B7280"/>
           <w:sz w:val="18"/>
           <w:szCs w:val="18"/>
@@ -1478,39 +1517,52 @@
       </w:r>
     </w:p>
     <w:sectPr>
-      <w:headerReference w:type="default" r:id="rId6"/>
-      <w:footerReference w:type="default" r:id="rId7"/>
-      <w:pgSz w:w="12240" w:h="15840" w:orient="portrait"/>
+      <w:headerReference w:type="default" r:id="rId7"/>
+      <w:footerReference w:type="default" r:id="rId8"/>
+      <w:pgSz w:w="12240" w:h="15840"/>
       <w:pgMar w:top="1440" w:right="1440" w:bottom="1440" w:left="1440" w:header="708" w:footer="708" w:gutter="0"/>
-      <w:pgNumType/>
+      <w:cols w:space="720"/>
       <w:docGrid w:linePitch="360"/>
     </w:sectPr>
   </w:body>
 </w:document>
 </file>
 
-<file path=word/comments.xml><?xml version="1.0" encoding="utf-8"?>
-<w:comments xmlns:cx="http://schemas.microsoft.com/office/drawing/2014/chartex" xmlns:cx1="http://schemas.microsoft.com/office/drawing/2015/9/8/chartex" xmlns:cx2="http://schemas.microsoft.com/office/drawing/2015/10/21/chartex" xmlns:cx3="http://schemas.microsoft.com/office/drawing/2016/5/9/chartex" xmlns:cx4="http://schemas.microsoft.com/office/drawing/2016/5/10/chartex" xmlns:cx5="http://schemas.microsoft.com/office/drawing/2016/5/11/chartex" xmlns:cx6="http://schemas.microsoft.com/office/drawing/2016/5/12/chartex" xmlns:cx7="http://schemas.microsoft.com/office/drawing/2016/5/13/chartex" xmlns:cx8="http://schemas.microsoft.com/office/drawing/2016/5/14/chartex" xmlns:mc="http://schemas.openxmlformats.org/markup-compatibility/2006" xmlns:aink="http://schemas.microsoft.com/office/drawing/2016/ink" xmlns:am3d="http://schemas.microsoft.com/office/drawing/2017/model3d" xmlns:o="urn:schemas-microsoft-com:office:office" xmlns:r="http://schemas.openxmlformats.org/officeDocument/2006/relationships" xmlns:m="http://schemas.openxmlformats.org/officeDocument/2006/math" xmlns:v="urn:schemas-microsoft-com:vml" xmlns:wp14="http://schemas.microsoft.com/office/word/2010/wordprocessingDrawing" xmlns:wp="http://schemas.openxmlformats.org/drawingml/2006/wordprocessingDrawing" xmlns:w10="urn:schemas-microsoft-com:office:word" xmlns:w="http://schemas.openxmlformats.org/wordprocessingml/2006/main" xmlns:w14="http://schemas.microsoft.com/office/word/2010/wordml" xmlns:w15="http://schemas.microsoft.com/office/word/2012/wordml" xmlns:w16cex="http://schemas.microsoft.com/office/word/2018/wordml/cex" xmlns:w16cid="http://schemas.microsoft.com/office/word/2016/wordml/cid" xmlns:w16="http://schemas.microsoft.com/office/word/2018/wordml" xmlns:w16sdtdh="http://schemas.microsoft.com/office/word/2020/wordml/sdtdatahash" xmlns:w16se="http://schemas.microsoft.com/office/word/2015/wordml/symex" xmlns:wpg="http://schemas.microsoft.com/office/word/2010/wordprocessingGroup" xmlns:wpi="http://schemas.microsoft.com/office/word/2010/wordprocessingInk" xmlns:wne="http://schemas.microsoft.com/office/word/2006/wordml" xmlns:wps="http://schemas.microsoft.com/office/word/2010/wordprocessingShape"/>
+<file path=word/endnotes.xml><?xml version="1.0" encoding="utf-8"?>
+<w:endnotes xmlns:wpc="http://schemas.microsoft.com/office/word/2010/wordprocessingCanvas" xmlns:cx="http://schemas.microsoft.com/office/drawing/2014/chartex" xmlns:cx1="http://schemas.microsoft.com/office/drawing/2015/9/8/chartex" xmlns:cx2="http://schemas.microsoft.com/office/drawing/2015/10/21/chartex" xmlns:cx3="http://schemas.microsoft.com/office/drawing/2016/5/9/chartex" xmlns:cx4="http://schemas.microsoft.com/office/drawing/2016/5/10/chartex" xmlns:cx5="http://schemas.microsoft.com/office/drawing/2016/5/11/chartex" xmlns:cx6="http://schemas.microsoft.com/office/drawing/2016/5/12/chartex" xmlns:cx7="http://schemas.microsoft.com/office/drawing/2016/5/13/chartex" xmlns:cx8="http://schemas.microsoft.com/office/drawing/2016/5/14/chartex" xmlns:mc="http://schemas.openxmlformats.org/markup-compatibility/2006" xmlns:aink="http://schemas.microsoft.com/office/drawing/2016/ink" xmlns:am3d="http://schemas.microsoft.com/office/drawing/2017/model3d" xmlns:o="urn:schemas-microsoft-com:office:office" xmlns:oel="http://schemas.microsoft.com/office/2019/extlst" xmlns:r="http://schemas.openxmlformats.org/officeDocument/2006/relationships" xmlns:m="http://schemas.openxmlformats.org/officeDocument/2006/math" xmlns:v="urn:schemas-microsoft-com:vml" xmlns:wp14="http://schemas.microsoft.com/office/word/2010/wordprocessingDrawing" xmlns:wp="http://schemas.openxmlformats.org/drawingml/2006/wordprocessingDrawing" xmlns:w10="urn:schemas-microsoft-com:office:word" xmlns:w="http://schemas.openxmlformats.org/wordprocessingml/2006/main" xmlns:w14="http://schemas.microsoft.com/office/word/2010/wordml" xmlns:w15="http://schemas.microsoft.com/office/word/2012/wordml" xmlns:w16cex="http://schemas.microsoft.com/office/word/2018/wordml/cex" xmlns:w16cid="http://schemas.microsoft.com/office/word/2016/wordml/cid" xmlns:w16="http://schemas.microsoft.com/office/word/2018/wordml" xmlns:w16du="http://schemas.microsoft.com/office/word/2023/wordml/word16du" xmlns:w16sdtdh="http://schemas.microsoft.com/office/word/2020/wordml/sdtdatahash" xmlns:w16sdtfl="http://schemas.microsoft.com/office/word/2024/wordml/sdtformatlock" xmlns:w16se="http://schemas.microsoft.com/office/word/2015/wordml/symex" xmlns:wpg="http://schemas.microsoft.com/office/word/2010/wordprocessingGroup" xmlns:wpi="http://schemas.microsoft.com/office/word/2010/wordprocessingInk" xmlns:wne="http://schemas.microsoft.com/office/word/2006/wordml" xmlns:wps="http://schemas.microsoft.com/office/word/2010/wordprocessingShape" mc:Ignorable="w14 w15 w16se w16cid w16 w16cex w16sdtdh w16sdtfl w16du wp14">
+  <w:endnote w:type="separator" w:id="-1">
+    <w:p>
+      <w:r>
+        <w:separator/>
+      </w:r>
+    </w:p>
+  </w:endnote>
+  <w:endnote w:type="continuationSeparator" w:id="0">
+    <w:p>
+      <w:r>
+        <w:continuationSeparator/>
+      </w:r>
+    </w:p>
+  </w:endnote>
+</w:endnotes>
 </file>
 
 <file path=word/footer1.xml><?xml version="1.0" encoding="utf-8"?>
-<w:ftr xmlns:wpc="http://schemas.microsoft.com/office/word/2010/wordprocessingCanvas" xmlns:mc="http://schemas.openxmlformats.org/markup-compatibility/2006" xmlns:o="urn:schemas-microsoft-com:office:office" xmlns:r="http://schemas.openxmlformats.org/officeDocument/2006/relationships" xmlns:m="http://schemas.openxmlformats.org/officeDocument/2006/math" xmlns:v="urn:schemas-microsoft-com:vml" xmlns:wp14="http://schemas.microsoft.com/office/word/2010/wordprocessingDrawing" xmlns:wp="http://schemas.openxmlformats.org/drawingml/2006/wordprocessingDrawing" xmlns:w10="urn:schemas-microsoft-com:office:word" xmlns:w="http://schemas.openxmlformats.org/wordprocessingml/2006/main" xmlns:w14="http://schemas.microsoft.com/office/word/2010/wordml" xmlns:w15="http://schemas.microsoft.com/office/word/2012/wordml" xmlns:wpg="http://schemas.microsoft.com/office/word/2010/wordprocessingGroup" xmlns:wpi="http://schemas.microsoft.com/office/word/2010/wordprocessingInk" xmlns:wne="http://schemas.microsoft.com/office/word/2006/wordml" xmlns:wps="http://schemas.microsoft.com/office/word/2010/wordprocessingShape">
+<w:ftr xmlns:wpc="http://schemas.microsoft.com/office/word/2010/wordprocessingCanvas" xmlns:cx="http://schemas.microsoft.com/office/drawing/2014/chartex" xmlns:cx1="http://schemas.microsoft.com/office/drawing/2015/9/8/chartex" xmlns:cx2="http://schemas.microsoft.com/office/drawing/2015/10/21/chartex" xmlns:cx3="http://schemas.microsoft.com/office/drawing/2016/5/9/chartex" xmlns:cx4="http://schemas.microsoft.com/office/drawing/2016/5/10/chartex" xmlns:cx5="http://schemas.microsoft.com/office/drawing/2016/5/11/chartex" xmlns:cx6="http://schemas.microsoft.com/office/drawing/2016/5/12/chartex" xmlns:cx7="http://schemas.microsoft.com/office/drawing/2016/5/13/chartex" xmlns:cx8="http://schemas.microsoft.com/office/drawing/2016/5/14/chartex" xmlns:mc="http://schemas.openxmlformats.org/markup-compatibility/2006" xmlns:aink="http://schemas.microsoft.com/office/drawing/2016/ink" xmlns:am3d="http://schemas.microsoft.com/office/drawing/2017/model3d" xmlns:o="urn:schemas-microsoft-com:office:office" xmlns:oel="http://schemas.microsoft.com/office/2019/extlst" xmlns:r="http://schemas.openxmlformats.org/officeDocument/2006/relationships" xmlns:m="http://schemas.openxmlformats.org/officeDocument/2006/math" xmlns:v="urn:schemas-microsoft-com:vml" xmlns:wp14="http://schemas.microsoft.com/office/word/2010/wordprocessingDrawing" xmlns:wp="http://schemas.openxmlformats.org/drawingml/2006/wordprocessingDrawing" xmlns:w10="urn:schemas-microsoft-com:office:word" xmlns:w="http://schemas.openxmlformats.org/wordprocessingml/2006/main" xmlns:w14="http://schemas.microsoft.com/office/word/2010/wordml" xmlns:w15="http://schemas.microsoft.com/office/word/2012/wordml" xmlns:w16cex="http://schemas.microsoft.com/office/word/2018/wordml/cex" xmlns:w16cid="http://schemas.microsoft.com/office/word/2016/wordml/cid" xmlns:w16="http://schemas.microsoft.com/office/word/2018/wordml" xmlns:w16du="http://schemas.microsoft.com/office/word/2023/wordml/word16du" xmlns:w16sdtdh="http://schemas.microsoft.com/office/word/2020/wordml/sdtdatahash" xmlns:w16sdtfl="http://schemas.microsoft.com/office/word/2024/wordml/sdtformatlock" xmlns:w16se="http://schemas.microsoft.com/office/word/2015/wordml/symex" xmlns:wpg="http://schemas.microsoft.com/office/word/2010/wordprocessingGroup" xmlns:wpi="http://schemas.microsoft.com/office/word/2010/wordprocessingInk" xmlns:wne="http://schemas.microsoft.com/office/word/2006/wordml" xmlns:wps="http://schemas.microsoft.com/office/word/2010/wordprocessingShape" mc:Ignorable="w14 w15 w16se w16cid w16 w16cex w16sdtdh w16sdtfl w16du wp14">
   <w:p>
     <w:pPr>
       <w:jc w:val="center"/>
     </w:pPr>
     <w:r>
       <w:rPr>
-        <w:rFonts w:ascii="Arial" w:cs="Arial" w:eastAsia="Arial" w:hAnsi="Arial"/>
         <w:color w:val="6B7280"/>
         <w:sz w:val="16"/>
         <w:szCs w:val="16"/>
       </w:rPr>
-      <w:t xml:space="preserve">Global Islamic Fund for Refugees</w:t>
+      <w:t>Global Islamic Fund for Refugees</w:t>
     </w:r>
     <w:r>
       <w:rPr>
-        <w:rFonts w:ascii="Arial" w:cs="Arial" w:eastAsia="Arial" w:hAnsi="Arial"/>
         <w:i/>
         <w:iCs/>
         <w:color w:val="6B7280"/>
@@ -1524,18 +1576,9 @@
 </file>
 
 <file path=word/footnotes.xml><?xml version="1.0" encoding="utf-8"?>
-<w:footnotes xmlns:wpc="http://schemas.microsoft.com/office/word/2010/wordprocessingCanvas" xmlns:mc="http://schemas.openxmlformats.org/markup-compatibility/2006" xmlns:o="urn:schemas-microsoft-com:office:office" xmlns:r="http://schemas.openxmlformats.org/officeDocument/2006/relationships" xmlns:m="http://schemas.openxmlformats.org/officeDocument/2006/math" xmlns:v="urn:schemas-microsoft-com:vml" xmlns:wp14="http://schemas.microsoft.com/office/word/2010/wordprocessingDrawing" xmlns:wp="http://schemas.openxmlformats.org/drawingml/2006/wordprocessingDrawing" xmlns:w10="urn:schemas-microsoft-com:office:word" xmlns:w="http://schemas.openxmlformats.org/wordprocessingml/2006/main" xmlns:w14="http://schemas.microsoft.com/office/word/2010/wordml" xmlns:w15="http://schemas.microsoft.com/office/word/2012/wordml" xmlns:wpg="http://schemas.microsoft.com/office/word/2010/wordprocessingGroup" xmlns:wpi="http://schemas.microsoft.com/office/word/2010/wordprocessingInk" xmlns:wne="http://schemas.microsoft.com/office/word/2006/wordml" xmlns:wps="http://schemas.microsoft.com/office/word/2010/wordprocessingShape" mc:Ignorable="w14 w15 wp14">
+<w:footnotes xmlns:wpc="http://schemas.microsoft.com/office/word/2010/wordprocessingCanvas" xmlns:cx="http://schemas.microsoft.com/office/drawing/2014/chartex" xmlns:cx1="http://schemas.microsoft.com/office/drawing/2015/9/8/chartex" xmlns:cx2="http://schemas.microsoft.com/office/drawing/2015/10/21/chartex" xmlns:cx3="http://schemas.microsoft.com/office/drawing/2016/5/9/chartex" xmlns:cx4="http://schemas.microsoft.com/office/drawing/2016/5/10/chartex" xmlns:cx5="http://schemas.microsoft.com/office/drawing/2016/5/11/chartex" xmlns:cx6="http://schemas.microsoft.com/office/drawing/2016/5/12/chartex" xmlns:cx7="http://schemas.microsoft.com/office/drawing/2016/5/13/chartex" xmlns:cx8="http://schemas.microsoft.com/office/drawing/2016/5/14/chartex" xmlns:mc="http://schemas.openxmlformats.org/markup-compatibility/2006" xmlns:aink="http://schemas.microsoft.com/office/drawing/2016/ink" xmlns:am3d="http://schemas.microsoft.com/office/drawing/2017/model3d" xmlns:o="urn:schemas-microsoft-com:office:office" xmlns:oel="http://schemas.microsoft.com/office/2019/extlst" xmlns:r="http://schemas.openxmlformats.org/officeDocument/2006/relationships" xmlns:m="http://schemas.openxmlformats.org/officeDocument/2006/math" xmlns:v="urn:schemas-microsoft-com:vml" xmlns:wp14="http://schemas.microsoft.com/office/word/2010/wordprocessingDrawing" xmlns:wp="http://schemas.openxmlformats.org/drawingml/2006/wordprocessingDrawing" xmlns:w10="urn:schemas-microsoft-com:office:word" xmlns:w="http://schemas.openxmlformats.org/wordprocessingml/2006/main" xmlns:w14="http://schemas.microsoft.com/office/word/2010/wordml" xmlns:w15="http://schemas.microsoft.com/office/word/2012/wordml" xmlns:w16cex="http://schemas.microsoft.com/office/word/2018/wordml/cex" xmlns:w16cid="http://schemas.microsoft.com/office/word/2016/wordml/cid" xmlns:w16="http://schemas.microsoft.com/office/word/2018/wordml" xmlns:w16du="http://schemas.microsoft.com/office/word/2023/wordml/word16du" xmlns:w16sdtdh="http://schemas.microsoft.com/office/word/2020/wordml/sdtdatahash" xmlns:w16sdtfl="http://schemas.microsoft.com/office/word/2024/wordml/sdtformatlock" xmlns:w16se="http://schemas.microsoft.com/office/word/2015/wordml/symex" xmlns:wpg="http://schemas.microsoft.com/office/word/2010/wordprocessingGroup" xmlns:wpi="http://schemas.microsoft.com/office/word/2010/wordprocessingInk" xmlns:wne="http://schemas.microsoft.com/office/word/2006/wordml" xmlns:wps="http://schemas.microsoft.com/office/word/2010/wordprocessingShape" mc:Ignorable="w14 w15 w16se w16cid w16 w16cex w16sdtdh w16sdtfl w16du wp14">
   <w:footnote w:type="separator" w:id="-1">
     <w:p>
-      <w:pPr>
-        <w:spacing w:after="0" w:line="240" w:lineRule="auto"/>
-      </w:pPr>
-      <w:r>
-        <w:rPr>
-          <w:rStyle w:val="FootnoteReference"/>
-        </w:rPr>
-        <w:footnoteRef/>
-      </w:r>
       <w:r>
         <w:separator/>
       </w:r>
@@ -1543,15 +1586,6 @@
   </w:footnote>
   <w:footnote w:type="continuationSeparator" w:id="0">
     <w:p>
-      <w:pPr>
-        <w:spacing w:after="0" w:line="240" w:lineRule="auto"/>
-      </w:pPr>
-      <w:r>
-        <w:rPr>
-          <w:rStyle w:val="FootnoteReference"/>
-        </w:rPr>
-        <w:footnoteRef/>
-      </w:r>
       <w:r>
         <w:continuationSeparator/>
       </w:r>
@@ -1561,23 +1595,21 @@
 </file>
 
 <file path=word/header1.xml><?xml version="1.0" encoding="utf-8"?>
-<w:hdr xmlns:wpc="http://schemas.microsoft.com/office/word/2010/wordprocessingCanvas" xmlns:mc="http://schemas.openxmlformats.org/markup-compatibility/2006" xmlns:o="urn:schemas-microsoft-com:office:office" xmlns:r="http://schemas.openxmlformats.org/officeDocument/2006/relationships" xmlns:m="http://schemas.openxmlformats.org/officeDocument/2006/math" xmlns:v="urn:schemas-microsoft-com:vml" xmlns:wp14="http://schemas.microsoft.com/office/word/2010/wordprocessingDrawing" xmlns:wp="http://schemas.openxmlformats.org/drawingml/2006/wordprocessingDrawing" xmlns:w10="urn:schemas-microsoft-com:office:word" xmlns:w="http://schemas.openxmlformats.org/wordprocessingml/2006/main" xmlns:w14="http://schemas.microsoft.com/office/word/2010/wordml" xmlns:w15="http://schemas.microsoft.com/office/word/2012/wordml" xmlns:wpg="http://schemas.microsoft.com/office/word/2010/wordprocessingGroup" xmlns:wpi="http://schemas.microsoft.com/office/word/2010/wordprocessingInk" xmlns:wne="http://schemas.microsoft.com/office/word/2006/wordml" xmlns:wps="http://schemas.microsoft.com/office/word/2010/wordprocessingShape" xmlns:cx="http://schemas.microsoft.com/office/drawing/2014/chartex" xmlns:cx1="http://schemas.microsoft.com/office/drawing/2015/9/8/chartex" xmlns:cx2="http://schemas.microsoft.com/office/drawing/2015/10/21/chartex" xmlns:cx3="http://schemas.microsoft.com/office/drawing/2016/5/9/chartex" xmlns:cx4="http://schemas.microsoft.com/office/drawing/2016/5/10/chartex" xmlns:cx5="http://schemas.microsoft.com/office/drawing/2016/5/11/chartex" xmlns:cx6="http://schemas.microsoft.com/office/drawing/2016/5/12/chartex" xmlns:cx7="http://schemas.microsoft.com/office/drawing/2016/5/13/chartex" xmlns:cx8="http://schemas.microsoft.com/office/drawing/2016/5/14/chartex" xmlns:w16cid="http://schemas.microsoft.com/office/word/2016/wordml/cid" xmlns:w16se="http://schemas.microsoft.com/office/word/2015/wordml/symex">
+<w:hdr xmlns:wpc="http://schemas.microsoft.com/office/word/2010/wordprocessingCanvas" xmlns:cx="http://schemas.microsoft.com/office/drawing/2014/chartex" xmlns:cx1="http://schemas.microsoft.com/office/drawing/2015/9/8/chartex" xmlns:cx2="http://schemas.microsoft.com/office/drawing/2015/10/21/chartex" xmlns:cx3="http://schemas.microsoft.com/office/drawing/2016/5/9/chartex" xmlns:cx4="http://schemas.microsoft.com/office/drawing/2016/5/10/chartex" xmlns:cx5="http://schemas.microsoft.com/office/drawing/2016/5/11/chartex" xmlns:cx6="http://schemas.microsoft.com/office/drawing/2016/5/12/chartex" xmlns:cx7="http://schemas.microsoft.com/office/drawing/2016/5/13/chartex" xmlns:cx8="http://schemas.microsoft.com/office/drawing/2016/5/14/chartex" xmlns:mc="http://schemas.openxmlformats.org/markup-compatibility/2006" xmlns:aink="http://schemas.microsoft.com/office/drawing/2016/ink" xmlns:am3d="http://schemas.microsoft.com/office/drawing/2017/model3d" xmlns:o="urn:schemas-microsoft-com:office:office" xmlns:oel="http://schemas.microsoft.com/office/2019/extlst" xmlns:r="http://schemas.openxmlformats.org/officeDocument/2006/relationships" xmlns:m="http://schemas.openxmlformats.org/officeDocument/2006/math" xmlns:v="urn:schemas-microsoft-com:vml" xmlns:wp14="http://schemas.microsoft.com/office/word/2010/wordprocessingDrawing" xmlns:wp="http://schemas.openxmlformats.org/drawingml/2006/wordprocessingDrawing" xmlns:w10="urn:schemas-microsoft-com:office:word" xmlns:w="http://schemas.openxmlformats.org/wordprocessingml/2006/main" xmlns:w14="http://schemas.microsoft.com/office/word/2010/wordml" xmlns:w15="http://schemas.microsoft.com/office/word/2012/wordml" xmlns:w16cex="http://schemas.microsoft.com/office/word/2018/wordml/cex" xmlns:w16cid="http://schemas.microsoft.com/office/word/2016/wordml/cid" xmlns:w16="http://schemas.microsoft.com/office/word/2018/wordml" xmlns:w16du="http://schemas.microsoft.com/office/word/2023/wordml/word16du" xmlns:w16sdtdh="http://schemas.microsoft.com/office/word/2020/wordml/sdtdatahash" xmlns:w16sdtfl="http://schemas.microsoft.com/office/word/2024/wordml/sdtformatlock" xmlns:w16se="http://schemas.microsoft.com/office/word/2015/wordml/symex" xmlns:wpg="http://schemas.microsoft.com/office/word/2010/wordprocessingGroup" xmlns:wpi="http://schemas.microsoft.com/office/word/2010/wordprocessingInk" xmlns:wne="http://schemas.microsoft.com/office/word/2006/wordml" xmlns:wps="http://schemas.microsoft.com/office/word/2010/wordprocessingShape" mc:Ignorable="w14 w15 w16se w16cid w16 w16cex w16sdtdh w16sdtfl w16du wp14">
   <w:p>
     <w:pPr>
       <w:jc w:val="right"/>
     </w:pPr>
     <w:r>
       <w:rPr>
-        <w:rFonts w:ascii="Arial" w:cs="Arial" w:eastAsia="Arial" w:hAnsi="Arial"/>
         <w:color w:val="6B7280"/>
         <w:sz w:val="18"/>
         <w:szCs w:val="18"/>
       </w:rPr>
-      <w:t xml:space="preserve">GIFR Donor Concierge</w:t>
+      <w:t>GIFR Donor Concierge</w:t>
     </w:r>
     <w:r>
       <w:rPr>
-        <w:rFonts w:ascii="Arial" w:cs="Arial" w:eastAsia="Arial" w:hAnsi="Arial"/>
         <w:color w:val="10B981"/>
         <w:sz w:val="18"/>
         <w:szCs w:val="18"/>
@@ -1589,10 +1621,12 @@
 </file>
 
 <file path=word/numbering.xml><?xml version="1.0" encoding="utf-8"?>
-<w:numbering xmlns:wpc="http://schemas.microsoft.com/office/word/2010/wordprocessingCanvas" xmlns:mc="http://schemas.openxmlformats.org/markup-compatibility/2006" xmlns:o="urn:schemas-microsoft-com:office:office" xmlns:r="http://schemas.openxmlformats.org/officeDocument/2006/relationships" xmlns:m="http://schemas.openxmlformats.org/officeDocument/2006/math" xmlns:v="urn:schemas-microsoft-com:vml" xmlns:wp14="http://schemas.microsoft.com/office/word/2010/wordprocessingDrawing" xmlns:wp="http://schemas.openxmlformats.org/drawingml/2006/wordprocessingDrawing" xmlns:w10="urn:schemas-microsoft-com:office:word" xmlns:w="http://schemas.openxmlformats.org/wordprocessingml/2006/main" xmlns:w14="http://schemas.microsoft.com/office/word/2010/wordml" xmlns:w15="http://schemas.microsoft.com/office/word/2012/wordml" xmlns:wpg="http://schemas.microsoft.com/office/word/2010/wordprocessingGroup" xmlns:wpi="http://schemas.microsoft.com/office/word/2010/wordprocessingInk" xmlns:wne="http://schemas.microsoft.com/office/word/2006/wordml" xmlns:wps="http://schemas.microsoft.com/office/word/2010/wordprocessingShape" mc:Ignorable="w14 w15 wp14">
-  <w:abstractNum w:abstractNumId="1" w15:restartNumberingAfterBreak="0">
+<w:numbering xmlns:wpc="http://schemas.microsoft.com/office/word/2010/wordprocessingCanvas" xmlns:cx="http://schemas.microsoft.com/office/drawing/2014/chartex" xmlns:cx1="http://schemas.microsoft.com/office/drawing/2015/9/8/chartex" xmlns:cx2="http://schemas.microsoft.com/office/drawing/2015/10/21/chartex" xmlns:cx3="http://schemas.microsoft.com/office/drawing/2016/5/9/chartex" xmlns:cx4="http://schemas.microsoft.com/office/drawing/2016/5/10/chartex" xmlns:cx5="http://schemas.microsoft.com/office/drawing/2016/5/11/chartex" xmlns:cx6="http://schemas.microsoft.com/office/drawing/2016/5/12/chartex" xmlns:cx7="http://schemas.microsoft.com/office/drawing/2016/5/13/chartex" xmlns:cx8="http://schemas.microsoft.com/office/drawing/2016/5/14/chartex" xmlns:mc="http://schemas.openxmlformats.org/markup-compatibility/2006" xmlns:aink="http://schemas.microsoft.com/office/drawing/2016/ink" xmlns:am3d="http://schemas.microsoft.com/office/drawing/2017/model3d" xmlns:o="urn:schemas-microsoft-com:office:office" xmlns:oel="http://schemas.microsoft.com/office/2019/extlst" xmlns:r="http://schemas.openxmlformats.org/officeDocument/2006/relationships" xmlns:m="http://schemas.openxmlformats.org/officeDocument/2006/math" xmlns:v="urn:schemas-microsoft-com:vml" xmlns:wp14="http://schemas.microsoft.com/office/word/2010/wordprocessingDrawing" xmlns:wp="http://schemas.openxmlformats.org/drawingml/2006/wordprocessingDrawing" xmlns:w10="urn:schemas-microsoft-com:office:word" xmlns:w="http://schemas.openxmlformats.org/wordprocessingml/2006/main" xmlns:w14="http://schemas.microsoft.com/office/word/2010/wordml" xmlns:w15="http://schemas.microsoft.com/office/word/2012/wordml" xmlns:w16cex="http://schemas.microsoft.com/office/word/2018/wordml/cex" xmlns:w16cid="http://schemas.microsoft.com/office/word/2016/wordml/cid" xmlns:w16="http://schemas.microsoft.com/office/word/2018/wordml" xmlns:w16du="http://schemas.microsoft.com/office/word/2023/wordml/word16du" xmlns:w16sdtdh="http://schemas.microsoft.com/office/word/2020/wordml/sdtdatahash" xmlns:w16sdtfl="http://schemas.microsoft.com/office/word/2024/wordml/sdtformatlock" xmlns:w16se="http://schemas.microsoft.com/office/word/2015/wordml/symex" xmlns:wpg="http://schemas.microsoft.com/office/word/2010/wordprocessingGroup" xmlns:wpi="http://schemas.microsoft.com/office/word/2010/wordprocessingInk" xmlns:wne="http://schemas.microsoft.com/office/word/2006/wordml" xmlns:wps="http://schemas.microsoft.com/office/word/2010/wordprocessingShape" mc:Ignorable="w14 w15 w16se w16cid w16 w16cex w16sdtdh w16sdtfl w16du wp14">
+  <w:abstractNum w:abstractNumId="0" w15:restartNumberingAfterBreak="0">
+    <w:nsid w:val="2C834691"/>
     <w:multiLevelType w:val="hybridMultilevel"/>
-    <w:lvl w:ilvl="0" w15:tentative="1">
+    <w:tmpl w:val="8E608ABC"/>
+    <w:lvl w:ilvl="0" w:tplc="E878E6C0">
       <w:start w:val="1"/>
       <w:numFmt w:val="bullet"/>
       <w:lvlText w:val="●"/>
@@ -1601,7 +1635,7 @@
         <w:ind w:left="720" w:hanging="360"/>
       </w:pPr>
     </w:lvl>
-    <w:lvl w:ilvl="1" w15:tentative="1">
+    <w:lvl w:ilvl="1" w:tplc="1A801530">
       <w:start w:val="1"/>
       <w:numFmt w:val="bullet"/>
       <w:lvlText w:val="○"/>
@@ -1610,7 +1644,7 @@
         <w:ind w:left="1440" w:hanging="360"/>
       </w:pPr>
     </w:lvl>
-    <w:lvl w:ilvl="2" w15:tentative="1">
+    <w:lvl w:ilvl="2" w:tplc="4DBA63AA">
       <w:start w:val="1"/>
       <w:numFmt w:val="bullet"/>
       <w:lvlText w:val="■"/>
@@ -1619,7 +1653,7 @@
         <w:ind w:left="2160" w:hanging="360"/>
       </w:pPr>
     </w:lvl>
-    <w:lvl w:ilvl="3" w15:tentative="1">
+    <w:lvl w:ilvl="3" w:tplc="ECC4D2BC">
       <w:start w:val="1"/>
       <w:numFmt w:val="bullet"/>
       <w:lvlText w:val="●"/>
@@ -1628,7 +1662,7 @@
         <w:ind w:left="2880" w:hanging="360"/>
       </w:pPr>
     </w:lvl>
-    <w:lvl w:ilvl="4" w15:tentative="1">
+    <w:lvl w:ilvl="4" w:tplc="EF260B3C">
       <w:start w:val="1"/>
       <w:numFmt w:val="bullet"/>
       <w:lvlText w:val="○"/>
@@ -1637,7 +1671,7 @@
         <w:ind w:left="3600" w:hanging="360"/>
       </w:pPr>
     </w:lvl>
-    <w:lvl w:ilvl="5" w15:tentative="1">
+    <w:lvl w:ilvl="5" w:tplc="781419F4">
       <w:start w:val="1"/>
       <w:numFmt w:val="bullet"/>
       <w:lvlText w:val="■"/>
@@ -1646,7 +1680,7 @@
         <w:ind w:left="4320" w:hanging="360"/>
       </w:pPr>
     </w:lvl>
-    <w:lvl w:ilvl="6" w15:tentative="1">
+    <w:lvl w:ilvl="6" w:tplc="118ED858">
       <w:start w:val="1"/>
       <w:numFmt w:val="bullet"/>
       <w:lvlText w:val="●"/>
@@ -1655,7 +1689,7 @@
         <w:ind w:left="5040" w:hanging="360"/>
       </w:pPr>
     </w:lvl>
-    <w:lvl w:ilvl="7" w15:tentative="1">
+    <w:lvl w:ilvl="7" w:tplc="38988DB0">
       <w:start w:val="1"/>
       <w:numFmt w:val="bullet"/>
       <w:lvlText w:val="●"/>
@@ -1664,7 +1698,7 @@
         <w:ind w:left="5760" w:hanging="360"/>
       </w:pPr>
     </w:lvl>
-    <w:lvl w:ilvl="8" w15:tentative="1">
+    <w:lvl w:ilvl="8" w:tplc="2DF6B324">
       <w:start w:val="1"/>
       <w:numFmt w:val="bullet"/>
       <w:lvlText w:val="●"/>
@@ -1674,8 +1708,8 @@
       </w:pPr>
     </w:lvl>
   </w:abstractNum>
-  <w:num w:numId="1">
-    <w:abstractNumId w:val="1"/>
+  <w:num w:numId="1" w16cid:durableId="886524572">
+    <w:abstractNumId w:val="0"/>
     <w:lvlOverride w:ilvl="0">
       <w:startOverride w:val="1"/>
     </w:lvlOverride>
@@ -1684,65 +1718,459 @@
 </file>
 
 <file path=word/styles.xml><?xml version="1.0" encoding="utf-8"?>
-<w:styles xmlns:mc="http://schemas.openxmlformats.org/markup-compatibility/2006" xmlns:r="http://schemas.openxmlformats.org/officeDocument/2006/relationships" xmlns:w="http://schemas.openxmlformats.org/wordprocessingml/2006/main" xmlns:w14="http://schemas.microsoft.com/office/word/2010/wordml" xmlns:w15="http://schemas.microsoft.com/office/word/2012/wordml" mc:Ignorable="w14 w15">
+<w:styles xmlns:mc="http://schemas.openxmlformats.org/markup-compatibility/2006" xmlns:r="http://schemas.openxmlformats.org/officeDocument/2006/relationships" xmlns:w="http://schemas.openxmlformats.org/wordprocessingml/2006/main" xmlns:w14="http://schemas.microsoft.com/office/word/2010/wordml" xmlns:w15="http://schemas.microsoft.com/office/word/2012/wordml" xmlns:w16cex="http://schemas.microsoft.com/office/word/2018/wordml/cex" xmlns:w16cid="http://schemas.microsoft.com/office/word/2016/wordml/cid" xmlns:w16="http://schemas.microsoft.com/office/word/2018/wordml" xmlns:w16du="http://schemas.microsoft.com/office/word/2023/wordml/word16du" xmlns:w16sdtdh="http://schemas.microsoft.com/office/word/2020/wordml/sdtdatahash" xmlns:w16sdtfl="http://schemas.microsoft.com/office/word/2024/wordml/sdtformatlock" xmlns:w16se="http://schemas.microsoft.com/office/word/2015/wordml/symex" mc:Ignorable="w14 w15 w16se w16cid w16 w16cex w16sdtdh w16sdtfl w16du">
   <w:docDefaults>
     <w:rPrDefault>
       <w:rPr>
-        <w:rFonts w:ascii="Arial" w:cs="Arial" w:eastAsia="Arial" w:hAnsi="Arial"/>
+        <w:rFonts w:ascii="Arial" w:eastAsia="Arial" w:hAnsi="Arial" w:cs="Arial"/>
         <w:sz w:val="22"/>
         <w:szCs w:val="22"/>
+        <w:lang w:val="en-ID" w:eastAsia="en-ID" w:bidi="ar-SA"/>
       </w:rPr>
     </w:rPrDefault>
     <w:pPrDefault/>
   </w:docDefaults>
-  <w:style w:type="paragraph" w:styleId="Title">
-    <w:name w:val="Title"/>
-    <w:basedOn w:val="Normal"/>
-    <w:next w:val="Normal"/>
+  <w:latentStyles w:defLockedState="0" w:defUIPriority="99" w:defSemiHidden="0" w:defUnhideWhenUsed="0" w:defQFormat="0" w:count="376">
+    <w:lsdException w:name="Normal" w:uiPriority="0" w:qFormat="1"/>
+    <w:lsdException w:name="heading 1" w:uiPriority="9" w:qFormat="1"/>
+    <w:lsdException w:name="heading 2" w:semiHidden="1" w:uiPriority="9" w:unhideWhenUsed="1" w:qFormat="1"/>
+    <w:lsdException w:name="heading 3" w:semiHidden="1" w:uiPriority="9" w:unhideWhenUsed="1" w:qFormat="1"/>
+    <w:lsdException w:name="heading 4" w:semiHidden="1" w:uiPriority="9" w:unhideWhenUsed="1" w:qFormat="1"/>
+    <w:lsdException w:name="heading 5" w:semiHidden="1" w:uiPriority="9" w:unhideWhenUsed="1" w:qFormat="1"/>
+    <w:lsdException w:name="heading 6" w:semiHidden="1" w:uiPriority="9" w:unhideWhenUsed="1" w:qFormat="1"/>
+    <w:lsdException w:name="heading 7" w:semiHidden="1" w:uiPriority="9" w:unhideWhenUsed="1" w:qFormat="1"/>
+    <w:lsdException w:name="heading 8" w:semiHidden="1" w:uiPriority="9" w:unhideWhenUsed="1" w:qFormat="1"/>
+    <w:lsdException w:name="heading 9" w:semiHidden="1" w:uiPriority="9" w:unhideWhenUsed="1" w:qFormat="1"/>
+    <w:lsdException w:name="index 1" w:semiHidden="1" w:unhideWhenUsed="1"/>
+    <w:lsdException w:name="index 2" w:semiHidden="1" w:unhideWhenUsed="1"/>
+    <w:lsdException w:name="index 3" w:semiHidden="1" w:unhideWhenUsed="1"/>
+    <w:lsdException w:name="index 4" w:semiHidden="1" w:unhideWhenUsed="1"/>
+    <w:lsdException w:name="index 5" w:semiHidden="1" w:unhideWhenUsed="1"/>
+    <w:lsdException w:name="index 6" w:semiHidden="1" w:unhideWhenUsed="1"/>
+    <w:lsdException w:name="index 7" w:semiHidden="1" w:unhideWhenUsed="1"/>
+    <w:lsdException w:name="index 8" w:semiHidden="1" w:unhideWhenUsed="1"/>
+    <w:lsdException w:name="index 9" w:semiHidden="1" w:unhideWhenUsed="1"/>
+    <w:lsdException w:name="toc 1" w:semiHidden="1" w:uiPriority="39" w:unhideWhenUsed="1"/>
+    <w:lsdException w:name="toc 2" w:semiHidden="1" w:uiPriority="39" w:unhideWhenUsed="1"/>
+    <w:lsdException w:name="toc 3" w:semiHidden="1" w:uiPriority="39" w:unhideWhenUsed="1"/>
+    <w:lsdException w:name="toc 4" w:semiHidden="1" w:uiPriority="39" w:unhideWhenUsed="1"/>
+    <w:lsdException w:name="toc 5" w:semiHidden="1" w:uiPriority="39" w:unhideWhenUsed="1"/>
+    <w:lsdException w:name="toc 6" w:semiHidden="1" w:uiPriority="39" w:unhideWhenUsed="1"/>
+    <w:lsdException w:name="toc 7" w:semiHidden="1" w:uiPriority="39" w:unhideWhenUsed="1"/>
+    <w:lsdException w:name="toc 8" w:semiHidden="1" w:uiPriority="39" w:unhideWhenUsed="1"/>
+    <w:lsdException w:name="toc 9" w:semiHidden="1" w:uiPriority="39" w:unhideWhenUsed="1"/>
+    <w:lsdException w:name="Normal Indent" w:semiHidden="1" w:unhideWhenUsed="1"/>
+    <w:lsdException w:name="footnote text" w:semiHidden="1" w:unhideWhenUsed="1"/>
+    <w:lsdException w:name="annotation text" w:semiHidden="1" w:unhideWhenUsed="1"/>
+    <w:lsdException w:name="header" w:semiHidden="1" w:unhideWhenUsed="1"/>
+    <w:lsdException w:name="footer" w:semiHidden="1" w:unhideWhenUsed="1"/>
+    <w:lsdException w:name="index heading" w:semiHidden="1" w:unhideWhenUsed="1"/>
+    <w:lsdException w:name="caption" w:semiHidden="1" w:uiPriority="35" w:unhideWhenUsed="1" w:qFormat="1"/>
+    <w:lsdException w:name="table of figures" w:semiHidden="1" w:unhideWhenUsed="1"/>
+    <w:lsdException w:name="envelope address" w:semiHidden="1" w:unhideWhenUsed="1"/>
+    <w:lsdException w:name="envelope return" w:semiHidden="1" w:unhideWhenUsed="1"/>
+    <w:lsdException w:name="footnote reference" w:semiHidden="1" w:unhideWhenUsed="1"/>
+    <w:lsdException w:name="annotation reference" w:semiHidden="1" w:unhideWhenUsed="1"/>
+    <w:lsdException w:name="line number" w:semiHidden="1" w:unhideWhenUsed="1"/>
+    <w:lsdException w:name="page number" w:semiHidden="1" w:unhideWhenUsed="1"/>
+    <w:lsdException w:name="endnote reference" w:semiHidden="1" w:unhideWhenUsed="1"/>
+    <w:lsdException w:name="endnote text" w:semiHidden="1" w:unhideWhenUsed="1"/>
+    <w:lsdException w:name="table of authorities" w:semiHidden="1" w:unhideWhenUsed="1"/>
+    <w:lsdException w:name="macro" w:semiHidden="1" w:unhideWhenUsed="1"/>
+    <w:lsdException w:name="toa heading" w:semiHidden="1" w:unhideWhenUsed="1"/>
+    <w:lsdException w:name="List" w:semiHidden="1" w:unhideWhenUsed="1"/>
+    <w:lsdException w:name="List Bullet" w:semiHidden="1" w:unhideWhenUsed="1"/>
+    <w:lsdException w:name="List Number" w:semiHidden="1" w:unhideWhenUsed="1"/>
+    <w:lsdException w:name="List 2" w:semiHidden="1" w:unhideWhenUsed="1"/>
+    <w:lsdException w:name="List 3" w:semiHidden="1" w:unhideWhenUsed="1"/>
+    <w:lsdException w:name="List 4" w:semiHidden="1" w:unhideWhenUsed="1"/>
+    <w:lsdException w:name="List 5" w:semiHidden="1" w:unhideWhenUsed="1"/>
+    <w:lsdException w:name="List Bullet 2" w:semiHidden="1" w:unhideWhenUsed="1"/>
+    <w:lsdException w:name="List Bullet 3" w:semiHidden="1" w:unhideWhenUsed="1"/>
+    <w:lsdException w:name="List Bullet 4" w:semiHidden="1" w:unhideWhenUsed="1"/>
+    <w:lsdException w:name="List Bullet 5" w:semiHidden="1" w:unhideWhenUsed="1"/>
+    <w:lsdException w:name="List Number 2" w:semiHidden="1" w:unhideWhenUsed="1"/>
+    <w:lsdException w:name="List Number 3" w:semiHidden="1" w:unhideWhenUsed="1"/>
+    <w:lsdException w:name="List Number 4" w:semiHidden="1" w:unhideWhenUsed="1"/>
+    <w:lsdException w:name="List Number 5" w:semiHidden="1" w:unhideWhenUsed="1"/>
+    <w:lsdException w:name="Title" w:uiPriority="10" w:qFormat="1"/>
+    <w:lsdException w:name="Closing" w:semiHidden="1" w:unhideWhenUsed="1"/>
+    <w:lsdException w:name="Signature" w:semiHidden="1" w:unhideWhenUsed="1"/>
+    <w:lsdException w:name="Default Paragraph Font" w:semiHidden="1" w:uiPriority="1" w:unhideWhenUsed="1"/>
+    <w:lsdException w:name="Body Text" w:semiHidden="1" w:unhideWhenUsed="1"/>
+    <w:lsdException w:name="Body Text Indent" w:semiHidden="1" w:unhideWhenUsed="1"/>
+    <w:lsdException w:name="List Continue" w:semiHidden="1" w:unhideWhenUsed="1"/>
+    <w:lsdException w:name="List Continue 2" w:semiHidden="1" w:unhideWhenUsed="1"/>
+    <w:lsdException w:name="List Continue 3" w:semiHidden="1" w:unhideWhenUsed="1"/>
+    <w:lsdException w:name="List Continue 4" w:semiHidden="1" w:unhideWhenUsed="1"/>
+    <w:lsdException w:name="List Continue 5" w:semiHidden="1" w:unhideWhenUsed="1"/>
+    <w:lsdException w:name="Message Header" w:semiHidden="1" w:unhideWhenUsed="1"/>
+    <w:lsdException w:name="Subtitle" w:uiPriority="11" w:qFormat="1"/>
+    <w:lsdException w:name="Salutation" w:semiHidden="1" w:unhideWhenUsed="1"/>
+    <w:lsdException w:name="Date" w:semiHidden="1" w:unhideWhenUsed="1"/>
+    <w:lsdException w:name="Body Text First Indent" w:semiHidden="1" w:unhideWhenUsed="1"/>
+    <w:lsdException w:name="Body Text First Indent 2" w:semiHidden="1" w:unhideWhenUsed="1"/>
+    <w:lsdException w:name="Note Heading" w:semiHidden="1" w:unhideWhenUsed="1"/>
+    <w:lsdException w:name="Body Text 2" w:semiHidden="1" w:unhideWhenUsed="1"/>
+    <w:lsdException w:name="Body Text 3" w:semiHidden="1" w:unhideWhenUsed="1"/>
+    <w:lsdException w:name="Body Text Indent 2" w:semiHidden="1" w:unhideWhenUsed="1"/>
+    <w:lsdException w:name="Body Text Indent 3" w:semiHidden="1" w:unhideWhenUsed="1"/>
+    <w:lsdException w:name="Block Text" w:semiHidden="1" w:unhideWhenUsed="1"/>
+    <w:lsdException w:name="Hyperlink" w:semiHidden="1" w:unhideWhenUsed="1"/>
+    <w:lsdException w:name="FollowedHyperlink" w:semiHidden="1" w:unhideWhenUsed="1"/>
+    <w:lsdException w:name="Strong" w:uiPriority="22" w:qFormat="1"/>
+    <w:lsdException w:name="Emphasis" w:uiPriority="20" w:qFormat="1"/>
+    <w:lsdException w:name="Document Map" w:semiHidden="1" w:unhideWhenUsed="1"/>
+    <w:lsdException w:name="Plain Text" w:semiHidden="1" w:unhideWhenUsed="1"/>
+    <w:lsdException w:name="E-mail Signature" w:semiHidden="1" w:unhideWhenUsed="1"/>
+    <w:lsdException w:name="HTML Top of Form" w:semiHidden="1" w:unhideWhenUsed="1"/>
+    <w:lsdException w:name="HTML Bottom of Form" w:semiHidden="1" w:unhideWhenUsed="1"/>
+    <w:lsdException w:name="Normal (Web)" w:semiHidden="1" w:unhideWhenUsed="1"/>
+    <w:lsdException w:name="HTML Acronym" w:semiHidden="1" w:unhideWhenUsed="1"/>
+    <w:lsdException w:name="HTML Address" w:semiHidden="1" w:unhideWhenUsed="1"/>
+    <w:lsdException w:name="HTML Cite" w:semiHidden="1" w:unhideWhenUsed="1"/>
+    <w:lsdException w:name="HTML Code" w:semiHidden="1" w:unhideWhenUsed="1"/>
+    <w:lsdException w:name="HTML Definition" w:semiHidden="1" w:unhideWhenUsed="1"/>
+    <w:lsdException w:name="HTML Keyboard" w:semiHidden="1" w:unhideWhenUsed="1"/>
+    <w:lsdException w:name="HTML Preformatted" w:semiHidden="1" w:unhideWhenUsed="1"/>
+    <w:lsdException w:name="HTML Sample" w:semiHidden="1" w:unhideWhenUsed="1"/>
+    <w:lsdException w:name="HTML Typewriter" w:semiHidden="1" w:unhideWhenUsed="1"/>
+    <w:lsdException w:name="HTML Variable" w:semiHidden="1" w:unhideWhenUsed="1"/>
+    <w:lsdException w:name="Normal Table" w:semiHidden="1" w:unhideWhenUsed="1"/>
+    <w:lsdException w:name="annotation subject" w:semiHidden="1" w:unhideWhenUsed="1"/>
+    <w:lsdException w:name="No List" w:semiHidden="1" w:unhideWhenUsed="1"/>
+    <w:lsdException w:name="Outline List 1" w:semiHidden="1" w:unhideWhenUsed="1"/>
+    <w:lsdException w:name="Outline List 2" w:semiHidden="1" w:unhideWhenUsed="1"/>
+    <w:lsdException w:name="Outline List 3" w:semiHidden="1" w:unhideWhenUsed="1"/>
+    <w:lsdException w:name="Table Simple 1" w:semiHidden="1" w:unhideWhenUsed="1"/>
+    <w:lsdException w:name="Table Simple 2" w:semiHidden="1" w:unhideWhenUsed="1"/>
+    <w:lsdException w:name="Table Simple 3" w:semiHidden="1" w:unhideWhenUsed="1"/>
+    <w:lsdException w:name="Table Classic 1" w:semiHidden="1" w:unhideWhenUsed="1"/>
+    <w:lsdException w:name="Table Classic 2" w:semiHidden="1" w:unhideWhenUsed="1"/>
+    <w:lsdException w:name="Table Classic 3" w:semiHidden="1" w:unhideWhenUsed="1"/>
+    <w:lsdException w:name="Table Classic 4" w:semiHidden="1" w:unhideWhenUsed="1"/>
+    <w:lsdException w:name="Table Colorful 1" w:semiHidden="1" w:unhideWhenUsed="1"/>
+    <w:lsdException w:name="Table Colorful 2" w:semiHidden="1" w:unhideWhenUsed="1"/>
+    <w:lsdException w:name="Table Colorful 3" w:semiHidden="1" w:unhideWhenUsed="1"/>
+    <w:lsdException w:name="Table Columns 1" w:semiHidden="1" w:unhideWhenUsed="1"/>
+    <w:lsdException w:name="Table Columns 2" w:semiHidden="1" w:unhideWhenUsed="1"/>
+    <w:lsdException w:name="Table Columns 3" w:semiHidden="1" w:unhideWhenUsed="1"/>
+    <w:lsdException w:name="Table Columns 4" w:semiHidden="1" w:unhideWhenUsed="1"/>
+    <w:lsdException w:name="Table Columns 5" w:semiHidden="1" w:unhideWhenUsed="1"/>
+    <w:lsdException w:name="Table Grid 1" w:semiHidden="1" w:unhideWhenUsed="1"/>
+    <w:lsdException w:name="Table Grid 2" w:semiHidden="1" w:unhideWhenUsed="1"/>
+    <w:lsdException w:name="Table Grid 3" w:semiHidden="1" w:unhideWhenUsed="1"/>
+    <w:lsdException w:name="Table Grid 4" w:semiHidden="1" w:unhideWhenUsed="1"/>
+    <w:lsdException w:name="Table Grid 5" w:semiHidden="1" w:unhideWhenUsed="1"/>
+    <w:lsdException w:name="Table Grid 6" w:semiHidden="1" w:unhideWhenUsed="1"/>
+    <w:lsdException w:name="Table Grid 7" w:semiHidden="1" w:unhideWhenUsed="1"/>
+    <w:lsdException w:name="Table Grid 8" w:semiHidden="1" w:unhideWhenUsed="1"/>
+    <w:lsdException w:name="Table List 1" w:semiHidden="1" w:unhideWhenUsed="1"/>
+    <w:lsdException w:name="Table List 2" w:semiHidden="1" w:unhideWhenUsed="1"/>
+    <w:lsdException w:name="Table List 3" w:semiHidden="1" w:unhideWhenUsed="1"/>
+    <w:lsdException w:name="Table List 4" w:semiHidden="1" w:unhideWhenUsed="1"/>
+    <w:lsdException w:name="Table List 5" w:semiHidden="1" w:unhideWhenUsed="1"/>
+    <w:lsdException w:name="Table List 6" w:semiHidden="1" w:unhideWhenUsed="1"/>
+    <w:lsdException w:name="Table List 7" w:semiHidden="1" w:unhideWhenUsed="1"/>
+    <w:lsdException w:name="Table List 8" w:semiHidden="1" w:unhideWhenUsed="1"/>
+    <w:lsdException w:name="Table 3D effects 1" w:semiHidden="1" w:unhideWhenUsed="1"/>
+    <w:lsdException w:name="Table 3D effects 2" w:semiHidden="1" w:unhideWhenUsed="1"/>
+    <w:lsdException w:name="Table 3D effects 3" w:semiHidden="1" w:unhideWhenUsed="1"/>
+    <w:lsdException w:name="Table Contemporary" w:semiHidden="1" w:unhideWhenUsed="1"/>
+    <w:lsdException w:name="Table Elegant" w:semiHidden="1" w:unhideWhenUsed="1"/>
+    <w:lsdException w:name="Table Professional" w:semiHidden="1" w:unhideWhenUsed="1"/>
+    <w:lsdException w:name="Table Subtle 1" w:semiHidden="1" w:unhideWhenUsed="1"/>
+    <w:lsdException w:name="Table Subtle 2" w:semiHidden="1" w:unhideWhenUsed="1"/>
+    <w:lsdException w:name="Table Web 1" w:semiHidden="1" w:unhideWhenUsed="1"/>
+    <w:lsdException w:name="Table Web 2" w:semiHidden="1" w:unhideWhenUsed="1"/>
+    <w:lsdException w:name="Table Web 3" w:semiHidden="1" w:unhideWhenUsed="1"/>
+    <w:lsdException w:name="Balloon Text" w:semiHidden="1" w:unhideWhenUsed="1"/>
+    <w:lsdException w:name="Table Grid" w:uiPriority="39"/>
+    <w:lsdException w:name="Table Theme" w:semiHidden="1" w:unhideWhenUsed="1"/>
+    <w:lsdException w:name="Placeholder Text" w:semiHidden="1"/>
+    <w:lsdException w:name="No Spacing" w:uiPriority="1" w:qFormat="1"/>
+    <w:lsdException w:name="Light Shading" w:uiPriority="60"/>
+    <w:lsdException w:name="Light List" w:uiPriority="61"/>
+    <w:lsdException w:name="Light Grid" w:uiPriority="62"/>
+    <w:lsdException w:name="Medium Shading 1" w:uiPriority="63"/>
+    <w:lsdException w:name="Medium Shading 2" w:uiPriority="64"/>
+    <w:lsdException w:name="Medium List 1" w:uiPriority="65"/>
+    <w:lsdException w:name="Medium List 2" w:uiPriority="66"/>
+    <w:lsdException w:name="Medium Grid 1" w:uiPriority="67"/>
+    <w:lsdException w:name="Medium Grid 2" w:uiPriority="68"/>
+    <w:lsdException w:name="Medium Grid 3" w:uiPriority="69"/>
+    <w:lsdException w:name="Dark List" w:uiPriority="70"/>
+    <w:lsdException w:name="Colorful Shading" w:uiPriority="71"/>
+    <w:lsdException w:name="Colorful List" w:uiPriority="72"/>
+    <w:lsdException w:name="Colorful Grid" w:uiPriority="73"/>
+    <w:lsdException w:name="Light Shading Accent 1" w:uiPriority="60"/>
+    <w:lsdException w:name="Light List Accent 1" w:uiPriority="61"/>
+    <w:lsdException w:name="Light Grid Accent 1" w:uiPriority="62"/>
+    <w:lsdException w:name="Medium Shading 1 Accent 1" w:uiPriority="63"/>
+    <w:lsdException w:name="Medium Shading 2 Accent 1" w:uiPriority="64"/>
+    <w:lsdException w:name="Medium List 1 Accent 1" w:uiPriority="65"/>
+    <w:lsdException w:name="Revision" w:semiHidden="1"/>
+    <w:lsdException w:name="List Paragraph" w:uiPriority="34" w:qFormat="1"/>
+    <w:lsdException w:name="Quote" w:uiPriority="29" w:qFormat="1"/>
+    <w:lsdException w:name="Intense Quote" w:uiPriority="30" w:qFormat="1"/>
+    <w:lsdException w:name="Medium List 2 Accent 1" w:uiPriority="66"/>
+    <w:lsdException w:name="Medium Grid 1 Accent 1" w:uiPriority="67"/>
+    <w:lsdException w:name="Medium Grid 2 Accent 1" w:uiPriority="68"/>
+    <w:lsdException w:name="Medium Grid 3 Accent 1" w:uiPriority="69"/>
+    <w:lsdException w:name="Dark List Accent 1" w:uiPriority="70"/>
+    <w:lsdException w:name="Colorful Shading Accent 1" w:uiPriority="71"/>
+    <w:lsdException w:name="Colorful List Accent 1" w:uiPriority="72"/>
+    <w:lsdException w:name="Colorful Grid Accent 1" w:uiPriority="73"/>
+    <w:lsdException w:name="Light Shading Accent 2" w:uiPriority="60"/>
+    <w:lsdException w:name="Light List Accent 2" w:uiPriority="61"/>
+    <w:lsdException w:name="Light Grid Accent 2" w:uiPriority="62"/>
+    <w:lsdException w:name="Medium Shading 1 Accent 2" w:uiPriority="63"/>
+    <w:lsdException w:name="Medium Shading 2 Accent 2" w:uiPriority="64"/>
+    <w:lsdException w:name="Medium List 1 Accent 2" w:uiPriority="65"/>
+    <w:lsdException w:name="Medium List 2 Accent 2" w:uiPriority="66"/>
+    <w:lsdException w:name="Medium Grid 1 Accent 2" w:uiPriority="67"/>
+    <w:lsdException w:name="Medium Grid 2 Accent 2" w:uiPriority="68"/>
+    <w:lsdException w:name="Medium Grid 3 Accent 2" w:uiPriority="69"/>
+    <w:lsdException w:name="Dark List Accent 2" w:uiPriority="70"/>
+    <w:lsdException w:name="Colorful Shading Accent 2" w:uiPriority="71"/>
+    <w:lsdException w:name="Colorful List Accent 2" w:uiPriority="72"/>
+    <w:lsdException w:name="Colorful Grid Accent 2" w:uiPriority="73"/>
+    <w:lsdException w:name="Light Shading Accent 3" w:uiPriority="60"/>
+    <w:lsdException w:name="Light List Accent 3" w:uiPriority="61"/>
+    <w:lsdException w:name="Light Grid Accent 3" w:uiPriority="62"/>
+    <w:lsdException w:name="Medium Shading 1 Accent 3" w:uiPriority="63"/>
+    <w:lsdException w:name="Medium Shading 2 Accent 3" w:uiPriority="64"/>
+    <w:lsdException w:name="Medium List 1 Accent 3" w:uiPriority="65"/>
+    <w:lsdException w:name="Medium List 2 Accent 3" w:uiPriority="66"/>
+    <w:lsdException w:name="Medium Grid 1 Accent 3" w:uiPriority="67"/>
+    <w:lsdException w:name="Medium Grid 2 Accent 3" w:uiPriority="68"/>
+    <w:lsdException w:name="Medium Grid 3 Accent 3" w:uiPriority="69"/>
+    <w:lsdException w:name="Dark List Accent 3" w:uiPriority="70"/>
+    <w:lsdException w:name="Colorful Shading Accent 3" w:uiPriority="71"/>
+    <w:lsdException w:name="Colorful List Accent 3" w:uiPriority="72"/>
+    <w:lsdException w:name="Colorful Grid Accent 3" w:uiPriority="73"/>
+    <w:lsdException w:name="Light Shading Accent 4" w:uiPriority="60"/>
+    <w:lsdException w:name="Light List Accent 4" w:uiPriority="61"/>
+    <w:lsdException w:name="Light Grid Accent 4" w:uiPriority="62"/>
+    <w:lsdException w:name="Medium Shading 1 Accent 4" w:uiPriority="63"/>
+    <w:lsdException w:name="Medium Shading 2 Accent 4" w:uiPriority="64"/>
+    <w:lsdException w:name="Medium List 1 Accent 4" w:uiPriority="65"/>
+    <w:lsdException w:name="Medium List 2 Accent 4" w:uiPriority="66"/>
+    <w:lsdException w:name="Medium Grid 1 Accent 4" w:uiPriority="67"/>
+    <w:lsdException w:name="Medium Grid 2 Accent 4" w:uiPriority="68"/>
+    <w:lsdException w:name="Medium Grid 3 Accent 4" w:uiPriority="69"/>
+    <w:lsdException w:name="Dark List Accent 4" w:uiPriority="70"/>
+    <w:lsdException w:name="Colorful Shading Accent 4" w:uiPriority="71"/>
+    <w:lsdException w:name="Colorful List Accent 4" w:uiPriority="72"/>
+    <w:lsdException w:name="Colorful Grid Accent 4" w:uiPriority="73"/>
+    <w:lsdException w:name="Light Shading Accent 5" w:uiPriority="60"/>
+    <w:lsdException w:name="Light List Accent 5" w:uiPriority="61"/>
+    <w:lsdException w:name="Light Grid Accent 5" w:uiPriority="62"/>
+    <w:lsdException w:name="Medium Shading 1 Accent 5" w:uiPriority="63"/>
+    <w:lsdException w:name="Medium Shading 2 Accent 5" w:uiPriority="64"/>
+    <w:lsdException w:name="Medium List 1 Accent 5" w:uiPriority="65"/>
+    <w:lsdException w:name="Medium List 2 Accent 5" w:uiPriority="66"/>
+    <w:lsdException w:name="Medium Grid 1 Accent 5" w:uiPriority="67"/>
+    <w:lsdException w:name="Medium Grid 2 Accent 5" w:uiPriority="68"/>
+    <w:lsdException w:name="Medium Grid 3 Accent 5" w:uiPriority="69"/>
+    <w:lsdException w:name="Dark List Accent 5" w:uiPriority="70"/>
+    <w:lsdException w:name="Colorful Shading Accent 5" w:uiPriority="71"/>
+    <w:lsdException w:name="Colorful List Accent 5" w:uiPriority="72"/>
+    <w:lsdException w:name="Colorful Grid Accent 5" w:uiPriority="73"/>
+    <w:lsdException w:name="Light Shading Accent 6" w:uiPriority="60"/>
+    <w:lsdException w:name="Light List Accent 6" w:uiPriority="61"/>
+    <w:lsdException w:name="Light Grid Accent 6" w:uiPriority="62"/>
+    <w:lsdException w:name="Medium Shading 1 Accent 6" w:uiPriority="63"/>
+    <w:lsdException w:name="Medium Shading 2 Accent 6" w:uiPriority="64"/>
+    <w:lsdException w:name="Medium List 1 Accent 6" w:uiPriority="65"/>
+    <w:lsdException w:name="Medium List 2 Accent 6" w:uiPriority="66"/>
+    <w:lsdException w:name="Medium Grid 1 Accent 6" w:uiPriority="67"/>
+    <w:lsdException w:name="Medium Grid 2 Accent 6" w:uiPriority="68"/>
+    <w:lsdException w:name="Medium Grid 3 Accent 6" w:uiPriority="69"/>
+    <w:lsdException w:name="Dark List Accent 6" w:uiPriority="70"/>
+    <w:lsdException w:name="Colorful Shading Accent 6" w:uiPriority="71"/>
+    <w:lsdException w:name="Colorful List Accent 6" w:uiPriority="72"/>
+    <w:lsdException w:name="Colorful Grid Accent 6" w:uiPriority="73"/>
+    <w:lsdException w:name="Subtle Emphasis" w:uiPriority="19" w:qFormat="1"/>
+    <w:lsdException w:name="Intense Emphasis" w:uiPriority="21" w:qFormat="1"/>
+    <w:lsdException w:name="Subtle Reference" w:uiPriority="31" w:qFormat="1"/>
+    <w:lsdException w:name="Intense Reference" w:uiPriority="32" w:qFormat="1"/>
+    <w:lsdException w:name="Book Title" w:uiPriority="33" w:qFormat="1"/>
+    <w:lsdException w:name="Bibliography" w:semiHidden="1" w:uiPriority="37" w:unhideWhenUsed="1"/>
+    <w:lsdException w:name="TOC Heading" w:semiHidden="1" w:uiPriority="39" w:unhideWhenUsed="1" w:qFormat="1"/>
+    <w:lsdException w:name="Plain Table 1" w:uiPriority="41"/>
+    <w:lsdException w:name="Plain Table 2" w:uiPriority="42"/>
+    <w:lsdException w:name="Plain Table 3" w:uiPriority="43"/>
+    <w:lsdException w:name="Plain Table 4" w:uiPriority="44"/>
+    <w:lsdException w:name="Plain Table 5" w:uiPriority="45"/>
+    <w:lsdException w:name="Grid Table Light" w:uiPriority="40"/>
+    <w:lsdException w:name="Grid Table 1 Light" w:uiPriority="46"/>
+    <w:lsdException w:name="Grid Table 2" w:uiPriority="47"/>
+    <w:lsdException w:name="Grid Table 3" w:uiPriority="48"/>
+    <w:lsdException w:name="Grid Table 4" w:uiPriority="49"/>
+    <w:lsdException w:name="Grid Table 5 Dark" w:uiPriority="50"/>
+    <w:lsdException w:name="Grid Table 6 Colorful" w:uiPriority="51"/>
+    <w:lsdException w:name="Grid Table 7 Colorful" w:uiPriority="52"/>
+    <w:lsdException w:name="Grid Table 1 Light Accent 1" w:uiPriority="46"/>
+    <w:lsdException w:name="Grid Table 2 Accent 1" w:uiPriority="47"/>
+    <w:lsdException w:name="Grid Table 3 Accent 1" w:uiPriority="48"/>
+    <w:lsdException w:name="Grid Table 4 Accent 1" w:uiPriority="49"/>
+    <w:lsdException w:name="Grid Table 5 Dark Accent 1" w:uiPriority="50"/>
+    <w:lsdException w:name="Grid Table 6 Colorful Accent 1" w:uiPriority="51"/>
+    <w:lsdException w:name="Grid Table 7 Colorful Accent 1" w:uiPriority="52"/>
+    <w:lsdException w:name="Grid Table 1 Light Accent 2" w:uiPriority="46"/>
+    <w:lsdException w:name="Grid Table 2 Accent 2" w:uiPriority="47"/>
+    <w:lsdException w:name="Grid Table 3 Accent 2" w:uiPriority="48"/>
+    <w:lsdException w:name="Grid Table 4 Accent 2" w:uiPriority="49"/>
+    <w:lsdException w:name="Grid Table 5 Dark Accent 2" w:uiPriority="50"/>
+    <w:lsdException w:name="Grid Table 6 Colorful Accent 2" w:uiPriority="51"/>
+    <w:lsdException w:name="Grid Table 7 Colorful Accent 2" w:uiPriority="52"/>
+    <w:lsdException w:name="Grid Table 1 Light Accent 3" w:uiPriority="46"/>
+    <w:lsdException w:name="Grid Table 2 Accent 3" w:uiPriority="47"/>
+    <w:lsdException w:name="Grid Table 3 Accent 3" w:uiPriority="48"/>
+    <w:lsdException w:name="Grid Table 4 Accent 3" w:uiPriority="49"/>
+    <w:lsdException w:name="Grid Table 5 Dark Accent 3" w:uiPriority="50"/>
+    <w:lsdException w:name="Grid Table 6 Colorful Accent 3" w:uiPriority="51"/>
+    <w:lsdException w:name="Grid Table 7 Colorful Accent 3" w:uiPriority="52"/>
+    <w:lsdException w:name="Grid Table 1 Light Accent 4" w:uiPriority="46"/>
+    <w:lsdException w:name="Grid Table 2 Accent 4" w:uiPriority="47"/>
+    <w:lsdException w:name="Grid Table 3 Accent 4" w:uiPriority="48"/>
+    <w:lsdException w:name="Grid Table 4 Accent 4" w:uiPriority="49"/>
+    <w:lsdException w:name="Grid Table 5 Dark Accent 4" w:uiPriority="50"/>
+    <w:lsdException w:name="Grid Table 6 Colorful Accent 4" w:uiPriority="51"/>
+    <w:lsdException w:name="Grid Table 7 Colorful Accent 4" w:uiPriority="52"/>
+    <w:lsdException w:name="Grid Table 1 Light Accent 5" w:uiPriority="46"/>
+    <w:lsdException w:name="Grid Table 2 Accent 5" w:uiPriority="47"/>
+    <w:lsdException w:name="Grid Table 3 Accent 5" w:uiPriority="48"/>
+    <w:lsdException w:name="Grid Table 4 Accent 5" w:uiPriority="49"/>
+    <w:lsdException w:name="Grid Table 5 Dark Accent 5" w:uiPriority="50"/>
+    <w:lsdException w:name="Grid Table 6 Colorful Accent 5" w:uiPriority="51"/>
+    <w:lsdException w:name="Grid Table 7 Colorful Accent 5" w:uiPriority="52"/>
+    <w:lsdException w:name="Grid Table 1 Light Accent 6" w:uiPriority="46"/>
+    <w:lsdException w:name="Grid Table 2 Accent 6" w:uiPriority="47"/>
+    <w:lsdException w:name="Grid Table 3 Accent 6" w:uiPriority="48"/>
+    <w:lsdException w:name="Grid Table 4 Accent 6" w:uiPriority="49"/>
+    <w:lsdException w:name="Grid Table 5 Dark Accent 6" w:uiPriority="50"/>
+    <w:lsdException w:name="Grid Table 6 Colorful Accent 6" w:uiPriority="51"/>
+    <w:lsdException w:name="Grid Table 7 Colorful Accent 6" w:uiPriority="52"/>
+    <w:lsdException w:name="List Table 1 Light" w:uiPriority="46"/>
+    <w:lsdException w:name="List Table 2" w:uiPriority="47"/>
+    <w:lsdException w:name="List Table 3" w:uiPriority="48"/>
+    <w:lsdException w:name="List Table 4" w:uiPriority="49"/>
+    <w:lsdException w:name="List Table 5 Dark" w:uiPriority="50"/>
+    <w:lsdException w:name="List Table 6 Colorful" w:uiPriority="51"/>
+    <w:lsdException w:name="List Table 7 Colorful" w:uiPriority="52"/>
+    <w:lsdException w:name="List Table 1 Light Accent 1" w:uiPriority="46"/>
+    <w:lsdException w:name="List Table 2 Accent 1" w:uiPriority="47"/>
+    <w:lsdException w:name="List Table 3 Accent 1" w:uiPriority="48"/>
+    <w:lsdException w:name="List Table 4 Accent 1" w:uiPriority="49"/>
+    <w:lsdException w:name="List Table 5 Dark Accent 1" w:uiPriority="50"/>
+    <w:lsdException w:name="List Table 6 Colorful Accent 1" w:uiPriority="51"/>
+    <w:lsdException w:name="List Table 7 Colorful Accent 1" w:uiPriority="52"/>
+    <w:lsdException w:name="List Table 1 Light Accent 2" w:uiPriority="46"/>
+    <w:lsdException w:name="List Table 2 Accent 2" w:uiPriority="47"/>
+    <w:lsdException w:name="List Table 3 Accent 2" w:uiPriority="48"/>
+    <w:lsdException w:name="List Table 4 Accent 2" w:uiPriority="49"/>
+    <w:lsdException w:name="List Table 5 Dark Accent 2" w:uiPriority="50"/>
+    <w:lsdException w:name="List Table 6 Colorful Accent 2" w:uiPriority="51"/>
+    <w:lsdException w:name="List Table 7 Colorful Accent 2" w:uiPriority="52"/>
+    <w:lsdException w:name="List Table 1 Light Accent 3" w:uiPriority="46"/>
+    <w:lsdException w:name="List Table 2 Accent 3" w:uiPriority="47"/>
+    <w:lsdException w:name="List Table 3 Accent 3" w:uiPriority="48"/>
+    <w:lsdException w:name="List Table 4 Accent 3" w:uiPriority="49"/>
+    <w:lsdException w:name="List Table 5 Dark Accent 3" w:uiPriority="50"/>
+    <w:lsdException w:name="List Table 6 Colorful Accent 3" w:uiPriority="51"/>
+    <w:lsdException w:name="List Table 7 Colorful Accent 3" w:uiPriority="52"/>
+    <w:lsdException w:name="List Table 1 Light Accent 4" w:uiPriority="46"/>
+    <w:lsdException w:name="List Table 2 Accent 4" w:uiPriority="47"/>
+    <w:lsdException w:name="List Table 3 Accent 4" w:uiPriority="48"/>
+    <w:lsdException w:name="List Table 4 Accent 4" w:uiPriority="49"/>
+    <w:lsdException w:name="List Table 5 Dark Accent 4" w:uiPriority="50"/>
+    <w:lsdException w:name="List Table 6 Colorful Accent 4" w:uiPriority="51"/>
+    <w:lsdException w:name="List Table 7 Colorful Accent 4" w:uiPriority="52"/>
+    <w:lsdException w:name="List Table 1 Light Accent 5" w:uiPriority="46"/>
+    <w:lsdException w:name="List Table 2 Accent 5" w:uiPriority="47"/>
+    <w:lsdException w:name="List Table 3 Accent 5" w:uiPriority="48"/>
+    <w:lsdException w:name="List Table 4 Accent 5" w:uiPriority="49"/>
+    <w:lsdException w:name="List Table 5 Dark Accent 5" w:uiPriority="50"/>
+    <w:lsdException w:name="List Table 6 Colorful Accent 5" w:uiPriority="51"/>
+    <w:lsdException w:name="List Table 7 Colorful Accent 5" w:uiPriority="52"/>
+    <w:lsdException w:name="List Table 1 Light Accent 6" w:uiPriority="46"/>
+    <w:lsdException w:name="List Table 2 Accent 6" w:uiPriority="47"/>
+    <w:lsdException w:name="List Table 3 Accent 6" w:uiPriority="48"/>
+    <w:lsdException w:name="List Table 4 Accent 6" w:uiPriority="49"/>
+    <w:lsdException w:name="List Table 5 Dark Accent 6" w:uiPriority="50"/>
+    <w:lsdException w:name="List Table 6 Colorful Accent 6" w:uiPriority="51"/>
+    <w:lsdException w:name="List Table 7 Colorful Accent 6" w:uiPriority="52"/>
+    <w:lsdException w:name="Mention" w:semiHidden="1" w:unhideWhenUsed="1"/>
+    <w:lsdException w:name="Smart Hyperlink" w:semiHidden="1" w:unhideWhenUsed="1"/>
+    <w:lsdException w:name="Hashtag" w:semiHidden="1" w:unhideWhenUsed="1"/>
+    <w:lsdException w:name="Unresolved Mention" w:semiHidden="1" w:unhideWhenUsed="1"/>
+    <w:lsdException w:name="Smart Link" w:semiHidden="1" w:unhideWhenUsed="1"/>
+  </w:latentStyles>
+  <w:style w:type="paragraph" w:default="1" w:styleId="Normal">
+    <w:name w:val="Normal"/>
     <w:qFormat/>
-    <w:rPr>
-      <w:sz w:val="56"/>
-      <w:szCs w:val="56"/>
-    </w:rPr>
   </w:style>
   <w:style w:type="paragraph" w:styleId="Heading1">
-    <w:name w:val="Heading 1"/>
-    <w:basedOn w:val="Normal"/>
-    <w:next w:val="Normal"/>
+    <w:name w:val="heading 1"/>
+    <w:uiPriority w:val="9"/>
     <w:qFormat/>
+    <w:pPr>
+      <w:spacing w:before="400" w:after="200"/>
+      <w:outlineLvl w:val="0"/>
+    </w:pPr>
     <w:rPr>
-      <w:color w:val="2E74B5"/>
-      <w:sz w:val="32"/>
-      <w:szCs w:val="32"/>
+      <w:b/>
+      <w:bCs/>
+      <w:color w:val="10B981"/>
+      <w:sz w:val="36"/>
+      <w:szCs w:val="36"/>
     </w:rPr>
   </w:style>
   <w:style w:type="paragraph" w:styleId="Heading2">
-    <w:name w:val="Heading 2"/>
-    <w:basedOn w:val="Normal"/>
-    <w:next w:val="Normal"/>
+    <w:name w:val="heading 2"/>
+    <w:uiPriority w:val="9"/>
+    <w:unhideWhenUsed/>
     <w:qFormat/>
+    <w:pPr>
+      <w:spacing w:before="300" w:after="150"/>
+      <w:outlineLvl w:val="1"/>
+    </w:pPr>
     <w:rPr>
-      <w:color w:val="2E74B5"/>
-      <w:sz w:val="26"/>
-      <w:szCs w:val="26"/>
+      <w:b/>
+      <w:bCs/>
+      <w:color w:val="1F2937"/>
+      <w:sz w:val="28"/>
+      <w:szCs w:val="28"/>
     </w:rPr>
   </w:style>
   <w:style w:type="paragraph" w:styleId="Heading3">
-    <w:name w:val="Heading 3"/>
-    <w:basedOn w:val="Normal"/>
-    <w:next w:val="Normal"/>
+    <w:name w:val="heading 3"/>
+    <w:uiPriority w:val="9"/>
+    <w:unhideWhenUsed/>
     <w:qFormat/>
+    <w:pPr>
+      <w:spacing w:before="200" w:after="100"/>
+      <w:outlineLvl w:val="2"/>
+    </w:pPr>
     <w:rPr>
-      <w:color w:val="1F4D78"/>
+      <w:b/>
+      <w:bCs/>
+      <w:color w:val="1F2937"/>
       <w:sz w:val="24"/>
       <w:szCs w:val="24"/>
     </w:rPr>
   </w:style>
   <w:style w:type="paragraph" w:styleId="Heading4">
-    <w:name w:val="Heading 4"/>
-    <w:basedOn w:val="Normal"/>
-    <w:next w:val="Normal"/>
+    <w:name w:val="heading 4"/>
+    <w:uiPriority w:val="9"/>
+    <w:semiHidden/>
+    <w:unhideWhenUsed/>
     <w:qFormat/>
+    <w:pPr>
+      <w:outlineLvl w:val="3"/>
+    </w:pPr>
     <w:rPr>
       <w:i/>
       <w:iCs/>
@@ -1750,27 +2178,69 @@
     </w:rPr>
   </w:style>
   <w:style w:type="paragraph" w:styleId="Heading5">
-    <w:name w:val="Heading 5"/>
-    <w:basedOn w:val="Normal"/>
-    <w:next w:val="Normal"/>
+    <w:name w:val="heading 5"/>
+    <w:uiPriority w:val="9"/>
+    <w:semiHidden/>
+    <w:unhideWhenUsed/>
     <w:qFormat/>
+    <w:pPr>
+      <w:outlineLvl w:val="4"/>
+    </w:pPr>
     <w:rPr>
       <w:color w:val="2E74B5"/>
     </w:rPr>
   </w:style>
   <w:style w:type="paragraph" w:styleId="Heading6">
-    <w:name w:val="Heading 6"/>
-    <w:basedOn w:val="Normal"/>
-    <w:next w:val="Normal"/>
+    <w:name w:val="heading 6"/>
+    <w:uiPriority w:val="9"/>
+    <w:semiHidden/>
+    <w:unhideWhenUsed/>
     <w:qFormat/>
+    <w:pPr>
+      <w:outlineLvl w:val="5"/>
+    </w:pPr>
     <w:rPr>
       <w:color w:val="1F4D78"/>
     </w:rPr>
   </w:style>
-  <w:style w:type="paragraph" w:styleId="Strong">
-    <w:name w:val="Strong"/>
-    <w:basedOn w:val="Normal"/>
-    <w:next w:val="Normal"/>
+  <w:style w:type="character" w:default="1" w:styleId="DefaultParagraphFont">
+    <w:name w:val="Default Paragraph Font"/>
+    <w:uiPriority w:val="1"/>
+    <w:semiHidden/>
+    <w:unhideWhenUsed/>
+  </w:style>
+  <w:style w:type="table" w:default="1" w:styleId="TableNormal">
+    <w:name w:val="Normal Table"/>
+    <w:uiPriority w:val="99"/>
+    <w:semiHidden/>
+    <w:unhideWhenUsed/>
+    <w:tblPr>
+      <w:tblInd w:w="0" w:type="dxa"/>
+      <w:tblCellMar>
+        <w:top w:w="0" w:type="dxa"/>
+        <w:left w:w="108" w:type="dxa"/>
+        <w:bottom w:w="0" w:type="dxa"/>
+        <w:right w:w="108" w:type="dxa"/>
+      </w:tblCellMar>
+    </w:tblPr>
+  </w:style>
+  <w:style w:type="numbering" w:default="1" w:styleId="NoList">
+    <w:name w:val="No List"/>
+    <w:uiPriority w:val="99"/>
+    <w:semiHidden/>
+    <w:unhideWhenUsed/>
+  </w:style>
+  <w:style w:type="paragraph" w:styleId="Title">
+    <w:name w:val="Title"/>
+    <w:uiPriority w:val="10"/>
+    <w:qFormat/>
+    <w:rPr>
+      <w:sz w:val="56"/>
+      <w:szCs w:val="56"/>
+    </w:rPr>
+  </w:style>
+  <w:style w:type="paragraph" w:customStyle="1" w:styleId="Strong1">
+    <w:name w:val="Strong1"/>
     <w:qFormat/>
     <w:rPr>
       <w:b/>
@@ -1779,12 +2249,10 @@
   </w:style>
   <w:style w:type="paragraph" w:styleId="ListParagraph">
     <w:name w:val="List Paragraph"/>
-    <w:basedOn w:val="Normal"/>
     <w:qFormat/>
   </w:style>
   <w:style w:type="character" w:styleId="Hyperlink">
     <w:name w:val="Hyperlink"/>
-    <w:basedOn w:val="DefaultParagraphFont"/>
     <w:uiPriority w:val="99"/>
     <w:unhideWhenUsed/>
     <w:rPr>
@@ -1794,7 +2262,6 @@
   </w:style>
   <w:style w:type="character" w:styleId="FootnoteReference">
     <w:name w:val="footnote reference"/>
-    <w:basedOn w:val="DefaultParagraphFont"/>
     <w:uiPriority w:val="99"/>
     <w:semiHidden/>
     <w:unhideWhenUsed/>
@@ -1804,22 +2271,17 @@
   </w:style>
   <w:style w:type="paragraph" w:styleId="FootnoteText">
     <w:name w:val="footnote text"/>
-    <w:basedOn w:val="Normal"/>
     <w:link w:val="FootnoteTextChar"/>
     <w:uiPriority w:val="99"/>
     <w:semiHidden/>
     <w:unhideWhenUsed/>
-    <w:pPr>
-      <w:spacing w:after="0" w:line="240" w:lineRule="auto"/>
-    </w:pPr>
     <w:rPr>
       <w:sz w:val="20"/>
       <w:szCs w:val="20"/>
     </w:rPr>
   </w:style>
-  <w:style w:type="character" w:styleId="FootnoteTextChar">
+  <w:style w:type="character" w:customStyle="1" w:styleId="FootnoteTextChar">
     <w:name w:val="Footnote Text Char"/>
-    <w:basedOn w:val="DefaultParagraphFont"/>
     <w:link w:val="FootnoteText"/>
     <w:uiPriority w:val="99"/>
     <w:semiHidden/>
@@ -1829,59 +2291,300 @@
       <w:szCs w:val="20"/>
     </w:rPr>
   </w:style>
-  <w:style w:type="paragraph" w:styleId="Heading1">
-    <w:name w:val="Heading 1"/>
-    <w:basedOn w:val="Normal"/>
-    <w:next w:val="Normal"/>
-    <w:qFormat/>
-    <w:pPr>
-      <w:spacing w:before="400" w:after="200"/>
-      <w:outlineLvl w:val="0"/>
-    </w:pPr>
-    <w:rPr>
-      <w:rFonts w:ascii="Arial" w:cs="Arial" w:eastAsia="Arial" w:hAnsi="Arial"/>
-      <w:b/>
-      <w:bCs/>
-      <w:color w:val="10B981"/>
-      <w:sz w:val="36"/>
-      <w:szCs w:val="36"/>
-    </w:rPr>
-  </w:style>
-  <w:style w:type="paragraph" w:styleId="Heading2">
-    <w:name w:val="Heading 2"/>
-    <w:basedOn w:val="Normal"/>
-    <w:next w:val="Normal"/>
-    <w:qFormat/>
-    <w:pPr>
-      <w:spacing w:before="300" w:after="150"/>
-      <w:outlineLvl w:val="1"/>
-    </w:pPr>
-    <w:rPr>
-      <w:rFonts w:ascii="Arial" w:cs="Arial" w:eastAsia="Arial" w:hAnsi="Arial"/>
-      <w:b/>
-      <w:bCs/>
-      <w:color w:val="1F2937"/>
-      <w:sz w:val="28"/>
-      <w:szCs w:val="28"/>
-    </w:rPr>
-  </w:style>
-  <w:style w:type="paragraph" w:styleId="Heading3">
-    <w:name w:val="Heading 3"/>
-    <w:basedOn w:val="Normal"/>
-    <w:next w:val="Normal"/>
-    <w:qFormat/>
-    <w:pPr>
-      <w:spacing w:before="200" w:after="100"/>
-      <w:outlineLvl w:val="2"/>
-    </w:pPr>
-    <w:rPr>
-      <w:rFonts w:ascii="Arial" w:cs="Arial" w:eastAsia="Arial" w:hAnsi="Arial"/>
-      <w:b/>
-      <w:bCs/>
-      <w:color w:val="1F2937"/>
-      <w:sz w:val="24"/>
-      <w:szCs w:val="24"/>
-    </w:rPr>
-  </w:style>
 </w:styles>
+</file>
+
+<file path=word/theme/theme1.xml><?xml version="1.0" encoding="utf-8"?>
+<a:theme xmlns:a="http://schemas.openxmlformats.org/drawingml/2006/main" name="Office Theme">
+  <a:themeElements>
+    <a:clrScheme name="Office">
+      <a:dk1>
+        <a:sysClr val="windowText" lastClr="000000"/>
+      </a:dk1>
+      <a:lt1>
+        <a:sysClr val="window" lastClr="FFFFFF"/>
+      </a:lt1>
+      <a:dk2>
+        <a:srgbClr val="44546A"/>
+      </a:dk2>
+      <a:lt2>
+        <a:srgbClr val="E7E6E6"/>
+      </a:lt2>
+      <a:accent1>
+        <a:srgbClr val="4472C4"/>
+      </a:accent1>
+      <a:accent2>
+        <a:srgbClr val="ED7D31"/>
+      </a:accent2>
+      <a:accent3>
+        <a:srgbClr val="A5A5A5"/>
+      </a:accent3>
+      <a:accent4>
+        <a:srgbClr val="FFC000"/>
+      </a:accent4>
+      <a:accent5>
+        <a:srgbClr val="5B9BD5"/>
+      </a:accent5>
+      <a:accent6>
+        <a:srgbClr val="70AD47"/>
+      </a:accent6>
+      <a:hlink>
+        <a:srgbClr val="0563C1"/>
+      </a:hlink>
+      <a:folHlink>
+        <a:srgbClr val="954F72"/>
+      </a:folHlink>
+    </a:clrScheme>
+    <a:fontScheme name="Office">
+      <a:majorFont>
+        <a:latin typeface="Calibri Light" panose="020F0302020204030204"/>
+        <a:ea typeface=""/>
+        <a:cs typeface=""/>
+        <a:font script="Jpan" typeface="游ゴシック Light"/>
+        <a:font script="Hang" typeface="맑은 고딕"/>
+        <a:font script="Hans" typeface="等线 Light"/>
+        <a:font script="Hant" typeface="新細明體"/>
+        <a:font script="Arab" typeface="Times New Roman"/>
+        <a:font script="Hebr" typeface="Times New Roman"/>
+        <a:font script="Thai" typeface="Angsana New"/>
+        <a:font script="Ethi" typeface="Nyala"/>
+        <a:font script="Beng" typeface="Vrinda"/>
+        <a:font script="Gujr" typeface="Shruti"/>
+        <a:font script="Khmr" typeface="MoolBoran"/>
+        <a:font script="Knda" typeface="Tunga"/>
+        <a:font script="Guru" typeface="Raavi"/>
+        <a:font script="Cans" typeface="Euphemia"/>
+        <a:font script="Cher" typeface="Plantagenet Cherokee"/>
+        <a:font script="Yiii" typeface="Microsoft Yi Baiti"/>
+        <a:font script="Tibt" typeface="Microsoft Himalaya"/>
+        <a:font script="Thaa" typeface="MV Boli"/>
+        <a:font script="Deva" typeface="Mangal"/>
+        <a:font script="Telu" typeface="Gautami"/>
+        <a:font script="Taml" typeface="Latha"/>
+        <a:font script="Syrc" typeface="Estrangelo Edessa"/>
+        <a:font script="Orya" typeface="Kalinga"/>
+        <a:font script="Mlym" typeface="Kartika"/>
+        <a:font script="Laoo" typeface="DokChampa"/>
+        <a:font script="Sinh" typeface="Iskoola Pota"/>
+        <a:font script="Mong" typeface="Mongolian Baiti"/>
+        <a:font script="Viet" typeface="Times New Roman"/>
+        <a:font script="Uigh" typeface="Microsoft Uighur"/>
+        <a:font script="Geor" typeface="Sylfaen"/>
+        <a:font script="Armn" typeface="Arial"/>
+        <a:font script="Bugi" typeface="Leelawadee UI"/>
+        <a:font script="Bopo" typeface="Microsoft JhengHei"/>
+        <a:font script="Java" typeface="Javanese Text"/>
+        <a:font script="Lisu" typeface="Segoe UI"/>
+        <a:font script="Mymr" typeface="Myanmar Text"/>
+        <a:font script="Nkoo" typeface="Ebrima"/>
+        <a:font script="Olck" typeface="Nirmala UI"/>
+        <a:font script="Osma" typeface="Ebrima"/>
+        <a:font script="Phag" typeface="Phagspa"/>
+        <a:font script="Syrn" typeface="Estrangelo Edessa"/>
+        <a:font script="Syrj" typeface="Estrangelo Edessa"/>
+        <a:font script="Syre" typeface="Estrangelo Edessa"/>
+        <a:font script="Sora" typeface="Nirmala UI"/>
+        <a:font script="Tale" typeface="Microsoft Tai Le"/>
+        <a:font script="Talu" typeface="Microsoft New Tai Lue"/>
+        <a:font script="Tfng" typeface="Ebrima"/>
+      </a:majorFont>
+      <a:minorFont>
+        <a:latin typeface="Calibri" panose="020F0502020204030204"/>
+        <a:ea typeface=""/>
+        <a:cs typeface=""/>
+        <a:font script="Jpan" typeface="游明朝"/>
+        <a:font script="Hang" typeface="맑은 고딕"/>
+        <a:font script="Hans" typeface="等线"/>
+        <a:font script="Hant" typeface="新細明體"/>
+        <a:font script="Arab" typeface="Arial"/>
+        <a:font script="Hebr" typeface="Arial"/>
+        <a:font script="Thai" typeface="Cordia New"/>
+        <a:font script="Ethi" typeface="Nyala"/>
+        <a:font script="Beng" typeface="Vrinda"/>
+        <a:font script="Gujr" typeface="Shruti"/>
+        <a:font script="Khmr" typeface="DaunPenh"/>
+        <a:font script="Knda" typeface="Tunga"/>
+        <a:font script="Guru" typeface="Raavi"/>
+        <a:font script="Cans" typeface="Euphemia"/>
+        <a:font script="Cher" typeface="Plantagenet Cherokee"/>
+        <a:font script="Yiii" typeface="Microsoft Yi Baiti"/>
+        <a:font script="Tibt" typeface="Microsoft Himalaya"/>
+        <a:font script="Thaa" typeface="MV Boli"/>
+        <a:font script="Deva" typeface="Mangal"/>
+        <a:font script="Telu" typeface="Gautami"/>
+        <a:font script="Taml" typeface="Latha"/>
+        <a:font script="Syrc" typeface="Estrangelo Edessa"/>
+        <a:font script="Orya" typeface="Kalinga"/>
+        <a:font script="Mlym" typeface="Kartika"/>
+        <a:font script="Laoo" typeface="DokChampa"/>
+        <a:font script="Sinh" typeface="Iskoola Pota"/>
+        <a:font script="Mong" typeface="Mongolian Baiti"/>
+        <a:font script="Viet" typeface="Arial"/>
+        <a:font script="Uigh" typeface="Microsoft Uighur"/>
+        <a:font script="Geor" typeface="Sylfaen"/>
+        <a:font script="Armn" typeface="Arial"/>
+        <a:font script="Bugi" typeface="Leelawadee UI"/>
+        <a:font script="Bopo" typeface="Microsoft JhengHei"/>
+        <a:font script="Java" typeface="Javanese Text"/>
+        <a:font script="Lisu" typeface="Segoe UI"/>
+        <a:font script="Mymr" typeface="Myanmar Text"/>
+        <a:font script="Nkoo" typeface="Ebrima"/>
+        <a:font script="Olck" typeface="Nirmala UI"/>
+        <a:font script="Osma" typeface="Ebrima"/>
+        <a:font script="Phag" typeface="Phagspa"/>
+        <a:font script="Syrn" typeface="Estrangelo Edessa"/>
+        <a:font script="Syrj" typeface="Estrangelo Edessa"/>
+        <a:font script="Syre" typeface="Estrangelo Edessa"/>
+        <a:font script="Sora" typeface="Nirmala UI"/>
+        <a:font script="Tale" typeface="Microsoft Tai Le"/>
+        <a:font script="Talu" typeface="Microsoft New Tai Lue"/>
+        <a:font script="Tfng" typeface="Ebrima"/>
+      </a:minorFont>
+    </a:fontScheme>
+    <a:fmtScheme name="Office">
+      <a:fillStyleLst>
+        <a:solidFill>
+          <a:schemeClr val="phClr"/>
+        </a:solidFill>
+        <a:gradFill rotWithShape="1">
+          <a:gsLst>
+            <a:gs pos="0">
+              <a:schemeClr val="phClr">
+                <a:lumMod val="110000"/>
+                <a:satMod val="105000"/>
+                <a:tint val="67000"/>
+              </a:schemeClr>
+            </a:gs>
+            <a:gs pos="50000">
+              <a:schemeClr val="phClr">
+                <a:lumMod val="105000"/>
+                <a:satMod val="103000"/>
+                <a:tint val="73000"/>
+              </a:schemeClr>
+            </a:gs>
+            <a:gs pos="100000">
+              <a:schemeClr val="phClr">
+                <a:lumMod val="105000"/>
+                <a:satMod val="109000"/>
+                <a:tint val="81000"/>
+              </a:schemeClr>
+            </a:gs>
+          </a:gsLst>
+          <a:lin ang="5400000" scaled="0"/>
+        </a:gradFill>
+        <a:gradFill rotWithShape="1">
+          <a:gsLst>
+            <a:gs pos="0">
+              <a:schemeClr val="phClr">
+                <a:satMod val="103000"/>
+                <a:lumMod val="102000"/>
+                <a:tint val="94000"/>
+              </a:schemeClr>
+            </a:gs>
+            <a:gs pos="50000">
+              <a:schemeClr val="phClr">
+                <a:satMod val="110000"/>
+                <a:lumMod val="100000"/>
+                <a:shade val="100000"/>
+              </a:schemeClr>
+            </a:gs>
+            <a:gs pos="100000">
+              <a:schemeClr val="phClr">
+                <a:lumMod val="99000"/>
+                <a:satMod val="120000"/>
+                <a:shade val="78000"/>
+              </a:schemeClr>
+            </a:gs>
+          </a:gsLst>
+          <a:lin ang="5400000" scaled="0"/>
+        </a:gradFill>
+      </a:fillStyleLst>
+      <a:lnStyleLst>
+        <a:ln w="6350" cap="flat" cmpd="sng" algn="ctr">
+          <a:solidFill>
+            <a:schemeClr val="phClr"/>
+          </a:solidFill>
+          <a:prstDash val="solid"/>
+          <a:miter lim="800000"/>
+        </a:ln>
+        <a:ln w="12700" cap="flat" cmpd="sng" algn="ctr">
+          <a:solidFill>
+            <a:schemeClr val="phClr"/>
+          </a:solidFill>
+          <a:prstDash val="solid"/>
+          <a:miter lim="800000"/>
+        </a:ln>
+        <a:ln w="19050" cap="flat" cmpd="sng" algn="ctr">
+          <a:solidFill>
+            <a:schemeClr val="phClr"/>
+          </a:solidFill>
+          <a:prstDash val="solid"/>
+          <a:miter lim="800000"/>
+        </a:ln>
+      </a:lnStyleLst>
+      <a:effectStyleLst>
+        <a:effectStyle>
+          <a:effectLst/>
+        </a:effectStyle>
+        <a:effectStyle>
+          <a:effectLst/>
+        </a:effectStyle>
+        <a:effectStyle>
+          <a:effectLst>
+            <a:outerShdw blurRad="57150" dist="19050" dir="5400000" algn="ctr" rotWithShape="0">
+              <a:srgbClr val="000000">
+                <a:alpha val="63000"/>
+              </a:srgbClr>
+            </a:outerShdw>
+          </a:effectLst>
+        </a:effectStyle>
+      </a:effectStyleLst>
+      <a:bgFillStyleLst>
+        <a:solidFill>
+          <a:schemeClr val="phClr"/>
+        </a:solidFill>
+        <a:solidFill>
+          <a:schemeClr val="phClr">
+            <a:tint val="95000"/>
+            <a:satMod val="170000"/>
+          </a:schemeClr>
+        </a:solidFill>
+        <a:gradFill rotWithShape="1">
+          <a:gsLst>
+            <a:gs pos="0">
+              <a:schemeClr val="phClr">
+                <a:tint val="93000"/>
+                <a:satMod val="150000"/>
+                <a:shade val="98000"/>
+                <a:lumMod val="102000"/>
+              </a:schemeClr>
+            </a:gs>
+            <a:gs pos="50000">
+              <a:schemeClr val="phClr">
+                <a:tint val="98000"/>
+                <a:satMod val="130000"/>
+                <a:shade val="90000"/>
+                <a:lumMod val="103000"/>
+              </a:schemeClr>
+            </a:gs>
+            <a:gs pos="100000">
+              <a:schemeClr val="phClr">
+                <a:shade val="63000"/>
+                <a:satMod val="120000"/>
+              </a:schemeClr>
+            </a:gs>
+          </a:gsLst>
+          <a:lin ang="5400000" scaled="0"/>
+        </a:gradFill>
+      </a:bgFillStyleLst>
+    </a:fmtScheme>
+  </a:themeElements>
+  <a:objectDefaults/>
+  <a:extraClrSchemeLst/>
+  <a:extLst>
+    <a:ext uri="{05A4C25C-085E-4340-85A3-A5531E510DB2}">
+      <thm15:themeFamily xmlns:thm15="http://schemas.microsoft.com/office/thememl/2012/main" name="Office Theme" id="{62F939B6-93AF-4DB8-9C6B-D6C7DFDC589F}" vid="{4A3C46E8-61CC-4603-A589-7422A47A8E4A}"/>
+    </a:ext>
+  </a:extLst>
+</a:theme>
 </file>
</xml_diff>